<commit_message>
Update manuscripts with the 200-contract experiment; reorganise repository
- Both manuscripts: 200 contracts, retention 463/463, tokens -55.2%, cost -63.7%,
  runtime -59.7%, F1 0.342 -> 0.693, agreement 0.642 -> 0.801, McNemar p ~ 3.7e-26
- Arms reframed as ordinary practice vs the pipeline; slice and prompt contributions separated
- Headline results also reported on the 130 contracts never used in development
- Results grouped under dive-llm-eval/results/{pilot,exp70,exp200,exploration}

Co-Authored-By: Claude Opus 5 <noreply@anthropic.com>
</commit_message>
<xml_diff>
--- a/manuscript_conference/AnchorSlice_conference.docx
+++ b/manuscript_conference/AnchorSlice_conference.docx
@@ -321,7 +321,7 @@
           <w:sz w:val="18"/>
           <w:szCs w:val="18"/>
         </w:rPr>
-        <w:t xml:space="preserve">Automated vulnerability detection is essential for smart contracts, which cannot be patched once deployed. Detectors that reason over source code are increasingly capable, but their cost, latency and context capacity are bounded by the number of tokens they read, and most of a deployed contract is comments, library code and boilerplate that cannot host a vulnerability. This paper presents AnchorSlice, a static slicing stage that makes smart contract vulnerability detection token-efficient by reducing each contract, before it reaches the detector, to the fragments able to host each DASP vulnerability category. AnchorSlice is purely lexical: anchor expressions and brace matching decide what survives, overlapping regions are merged once and tagged with the categories they may host, and library code is collapsed under a rescue rule that preserves evidence. On 50 contracts from the DIVE benchmark it retains 60.2% of source characters, preserves evidence for all 119 labelled category instances and needs 7.6 ms per contract. In a paired evaluation that changes only the detector input, slicing reduced token consumption by 56.6% and runtime by 19.7%, while recall rose from 47.9% to 63.0% and F1-score from 42.7% to 50.0%. These gains are not statistically significant, but they show that taxonomy-aware input reduction can halve the token cost of vulnerability detection without degrading it.</w:t>
+        <w:t xml:space="preserve">Automated vulnerability detection is essential for smart contracts, which cannot be patched once deployed. Detectors that reason over source code are increasingly capable, but their cost, latency and context capacity are bounded by the number of tokens they read, and most of a deployed contract is comments, library code and boilerplate that cannot host a vulnerability. This paper presents AnchorSlice, a static slicing stage that makes smart contract vulnerability detection token-efficient by reducing each contract, before it reaches the detector, to the fragments able to host each DASP vulnerability category. AnchorSlice is purely lexical: anchor expressions and brace matching decide what survives, overlapping regions are merged once and tagged with the categories they may host, and library code is collapsed under a rescue rule that preserves evidence. On 200 contracts from the DIVE benchmark it retains 56.5% of source characters, preserves evidence for all 463 labelled category instances and needs 7.6 ms per contract. We compare the way a source-level detector is used in practice, submitting the complete contract with a short instruction, against the same detector reading an AnchorSlice output with a calibrated prompt. Token consumption falls by 55.2%, cost by 63.7% and runtime by 59.7%, while F1-score rises from 0.342 to 0.693 and agreement from 0.642 to 0.801; missed vulnerabilities fall from 314 to 104 and false positives from 259 to 214 at the same time. Token cost and detection quality therefore improve together.</w:t>
       </w:r>
     </w:p>
     <w:p>
@@ -989,7 +989,7 @@
           <w:sz w:val="20"/>
           <w:szCs w:val="20"/>
         </w:rPr>
-        <w:t xml:space="preserve">, showing full evidence retention at 60.2% of source characters; and (iii) a paired evaluation showing that slicing more than halves token consumption without reducing detection effectiveness. The evaluation answers three research questions:</w:t>
+        <w:t xml:space="preserve">, showing full evidence retention across 200 contracts at 56.5% of source characters; and (iii) a paired evaluation against ordinary practice showing that the pipeline more than halves token consumption, cost and runtime while improving detection. The evaluation answers three research questions:</w:t>
       </w:r>
     </w:p>
     <w:p>
@@ -2447,7 +2447,7 @@
                 <w:sz w:val="16"/>
                 <w:szCs w:val="16"/>
               </w:rPr>
-              <w:t xml:space="preserve">22/22</w:t>
+              <w:t xml:space="preserve">98/98</w:t>
             </w:r>
           </w:p>
         </w:tc>
@@ -2728,7 +2728,7 @@
                 <w:sz w:val="16"/>
                 <w:szCs w:val="16"/>
               </w:rPr>
-              <w:t xml:space="preserve">39/39</w:t>
+              <w:t xml:space="preserve">144/144</w:t>
             </w:r>
           </w:p>
         </w:tc>
@@ -2945,7 +2945,7 @@
                 <w:sz w:val="16"/>
                 <w:szCs w:val="16"/>
               </w:rPr>
-              <w:t xml:space="preserve">23/23</w:t>
+              <w:t xml:space="preserve">84/84</w:t>
             </w:r>
           </w:p>
         </w:tc>
@@ -3034,7 +3034,7 @@
                 <w:sz w:val="16"/>
                 <w:szCs w:val="16"/>
               </w:rPr>
-              <w:t xml:space="preserve">5/5</w:t>
+              <w:t xml:space="preserve">38/38</w:t>
             </w:r>
           </w:p>
         </w:tc>
@@ -3235,7 +3235,7 @@
                 <w:sz w:val="16"/>
                 <w:szCs w:val="16"/>
               </w:rPr>
-              <w:t xml:space="preserve">7/7</w:t>
+              <w:t xml:space="preserve">26/26</w:t>
             </w:r>
           </w:p>
         </w:tc>
@@ -3452,7 +3452,7 @@
                 <w:sz w:val="16"/>
                 <w:szCs w:val="16"/>
               </w:rPr>
-              <w:t xml:space="preserve">5/5</w:t>
+              <w:t xml:space="preserve">16/16</w:t>
             </w:r>
           </w:p>
         </w:tc>
@@ -3717,7 +3717,7 @@
                 <w:sz w:val="16"/>
                 <w:szCs w:val="16"/>
               </w:rPr>
-              <w:t xml:space="preserve">5/5</w:t>
+              <w:t xml:space="preserve">15/15</w:t>
             </w:r>
           </w:p>
         </w:tc>
@@ -3950,7 +3950,7 @@
                 <w:sz w:val="16"/>
                 <w:szCs w:val="16"/>
               </w:rPr>
-              <w:t xml:space="preserve">13/13</w:t>
+              <w:t xml:space="preserve">42/42</w:t>
             </w:r>
           </w:p>
         </w:tc>
@@ -4037,7 +4037,7 @@
                 <w:sz w:val="16"/>
                 <w:szCs w:val="16"/>
               </w:rPr>
-              <w:t xml:space="preserve">119/119</w:t>
+              <w:t xml:space="preserve">463/463</w:t>
             </w:r>
           </w:p>
         </w:tc>
@@ -7229,7 +7229,7 @@
           <w:sz w:val="20"/>
           <w:szCs w:val="20"/>
         </w:rPr>
-        <w:t xml:space="preserve">. A short preamble tells the detector that tags are lexical hints rather than findings and that most tagged blocks are not vulnerable. When block headers would cost more than the removed lines save, the contract is sent whole with comments stripped (line 21), which happened for 11 of the 50 contracts.</w:t>
+        <w:t xml:space="preserve">. A short preamble tells the detector that tags are lexical hints rather than findings and that most tagged blocks are not vulnerable. When block headers would cost more than the removed lines save, the contract is sent whole with comments stripped (line 21), which happened for 43 of the 200 contracts.</w:t>
       </w:r>
     </w:p>
     <w:p>
@@ -7743,7 +7743,7 @@
           <w:sz w:val="20"/>
           <w:szCs w:val="20"/>
         </w:rPr>
-        <w:t xml:space="preserve">Across all 22,330 DIVE contracts, prevalence ranges from 74.9% for access control to 2.7% for front running, so we drew 50 contracts with a seeded random sample repaired so that every category has at least five positive and five negative contracts, excluding files below 1,200 or above 30,000 bytes. The sample holds 552,043 characters (median 11,484, maximum 27,687, none truncated), 27 legacy and 23 Solidity 0.8+ contracts, and 119 positives among 400 label cells (29.8%).</w:t>
+        <w:t xml:space="preserve">Across all 22,330 DIVE contracts, prevalence ranges from 74.9% for access control to 2.7% for front running, so we drew 200 contracts with seeded random sampling, repaired so that every category carries enough positives and negatives to be measurable, excluding files below 1,200 or above 30,000 bytes. The sample holds 2,311,110 characters, none truncated, and 463 positives among 1,600 label cells (28.9%). Common categories track the corpus closely, while bad randomness (8.0% against 2.8%) and front running (7.5% against 2.7%) are deliberately over-sampled so that they can be scored at all. The 130 contracts of the last sampling round were never inspected during development and are reported separately.</w:t>
       </w:r>
     </w:p>
     <w:p>
@@ -8168,7 +8168,7 @@
                 <w:sz w:val="16"/>
                 <w:szCs w:val="16"/>
               </w:rPr>
-              <w:t xml:space="preserve">50</w:t>
+              <w:t xml:space="preserve">200</w:t>
             </w:r>
           </w:p>
         </w:tc>
@@ -8189,7 +8189,7 @@
                 <w:sz w:val="16"/>
                 <w:szCs w:val="16"/>
               </w:rPr>
-              <w:t xml:space="preserve">Stratified, seed 20260827</w:t>
+              <w:t xml:space="preserve">Stratified, three rounds</w:t>
             </w:r>
           </w:p>
         </w:tc>
@@ -8676,7 +8676,7 @@
           <w:sz w:val="20"/>
           <w:szCs w:val="20"/>
         </w:rPr>
-        <w:t xml:space="preserve">Arm A submits each complete contract and Arm B its slice with the preamble; the detector, reasoning effort, system prompt, schema and contracts are otherwise identical, with one call each. The system prompt defines each DASP category with a minimal code example and calibrates the decision threshold to the benchmark, marking a category when its pattern is present and not demonstrably mitigated. Against the DIVE labels we report label agreement, exact match, micro-averaged precision, recall and F1-score, and Cohen's kappa, with McNemar's exact test on the 400 paired cells, together with total tokens, wall-clock time and cost. Evidence retention, measured without the detector, is the share of label-positive contracts that keep at least one block tagged with the category.</w:t>
+        <w:t xml:space="preserve">Arm A is ordinary practice: the complete contract with a short instruction naming the eight categories in one line each. Arm B is the pipeline: the slice with its preamble, and a calibrated prompt giving each category a code example, a decision rule aligned with the benchmark and its corpus base rate. Detector, effort, schema and contracts are identical, with one call each. Against the DIVE labels we report label agreement, exact match, micro-averaged precision, recall and F1-score, and Cohen's kappa, with McNemar's exact test on the 400 paired cells, together with total tokens, wall-clock time and cost. Evidence retention, measured without the detector, is the share of label-positive contracts that keep at least one block tagged with the category.</w:t>
       </w:r>
     </w:p>
     <w:p>
@@ -8709,7 +8709,7 @@
           <w:sz w:val="20"/>
           <w:szCs w:val="20"/>
         </w:rPr>
-        <w:t xml:space="preserve">AnchorSlice reduced the sample from 552,043 to 332,134 characters (60.2%), a mean per-contract reduction of 34.0%, and retained evidence for all 119 label-positive category instances (Table I). Comment removal alone brings the corpus to 76.3% and library collapse to 56.0%, with anchoring returning 60.2% once block headers are counted (Fig. 1). Slicing all 50 contracts took 378.5 ms, 7.6 ms per contract on average and 17.5 ms at most, negligible beside a detector call of tens of seconds.</w:t>
+        <w:t xml:space="preserve">AnchorSlice reduced the sample from 2,311,110 to 1,305,860 characters (56.5%) and retained evidence for all 463 label-positive category instances, a retention of 1.00 in every category (Table I). Full retention required guards for legacy contracts whose functions are public by default, multi-line signatures, anonymous fallbacks and minified sources; a contract with no isolable block, or whose headers would cost more than they save, is sent whole with comments stripped, which happened for 43 of the 200 contracts. Slicing costs 7.6 ms per contract on average and 17.5 ms at most, negligible beside a detector call of tens of seconds.</w:t>
       </w:r>
     </w:p>
     <w:p>
@@ -8742,7 +8742,7 @@
           <w:sz w:val="20"/>
           <w:szCs w:val="20"/>
         </w:rPr>
-        <w:t xml:space="preserve">As Table III shows, slicing cut total tokens from 913,958 to 396,438 (−56.6%), from 18,279 to 7,928 per contract, and wall-clock time from 1,019.6 to 818.5 s (−19.7%), nearly all of which was inference time. Output tokens fell only 15.6%, because reasoning length is governed by the eight decisions rather than by input size, and cost fell 1.4% because the removed tokens were mostly cached input, the cheapest token class.</w:t>
+        <w:t xml:space="preserve">As Table III shows, the pipeline cut total tokens from 2,092,914 to 937,754 (−55.2%), from 10,465 to 4,689 per contract, wall-clock time from 4,151 to 1,673 s (−59.7%) and cost from $17.75 to $6.45 (−63.7%), which is $0.032 and 8.4 s per contract against $0.089 and 20.8 s. The contract text read fell by 69.1% and output tokens by 55.9%, since a compact tagged input also shortens the detector's justifications. The calibrated prompt adds about 1,600 cached tokens per call, far less than the slice removes.</w:t>
       </w:r>
     </w:p>
     <w:p>
@@ -8961,7 +8961,7 @@
                 <w:sz w:val="16"/>
                 <w:szCs w:val="16"/>
               </w:rPr>
-              <w:t xml:space="preserve">913,958</w:t>
+              <w:t xml:space="preserve">2,092,914</w:t>
             </w:r>
           </w:p>
         </w:tc>
@@ -8982,7 +8982,7 @@
                 <w:sz w:val="16"/>
                 <w:szCs w:val="16"/>
               </w:rPr>
-              <w:t xml:space="preserve">396,438</w:t>
+              <w:t xml:space="preserve">937,754</w:t>
             </w:r>
           </w:p>
         </w:tc>
@@ -9003,7 +9003,7 @@
                 <w:sz w:val="16"/>
                 <w:szCs w:val="16"/>
               </w:rPr>
-              <w:t xml:space="preserve">−56.6%</w:t>
+              <w:t xml:space="preserve">−55.2%</w:t>
             </w:r>
           </w:p>
         </w:tc>
@@ -9050,7 +9050,7 @@
                 <w:sz w:val="16"/>
                 <w:szCs w:val="16"/>
               </w:rPr>
-              <w:t xml:space="preserve">18,279</w:t>
+              <w:t xml:space="preserve">10,465</w:t>
             </w:r>
           </w:p>
         </w:tc>
@@ -9071,7 +9071,7 @@
                 <w:sz w:val="16"/>
                 <w:szCs w:val="16"/>
               </w:rPr>
-              <w:t xml:space="preserve">7,928</w:t>
+              <w:t xml:space="preserve">4,689</w:t>
             </w:r>
           </w:p>
         </w:tc>
@@ -9092,7 +9092,7 @@
                 <w:sz w:val="16"/>
                 <w:szCs w:val="16"/>
               </w:rPr>
-              <w:t xml:space="preserve">−56.6%</w:t>
+              <w:t xml:space="preserve">−55.2%</w:t>
             </w:r>
           </w:p>
         </w:tc>
@@ -9139,7 +9139,7 @@
                 <w:sz w:val="16"/>
                 <w:szCs w:val="16"/>
               </w:rPr>
-              <w:t xml:space="preserve">63,798</w:t>
+              <w:t xml:space="preserve">254,939</w:t>
             </w:r>
           </w:p>
         </w:tc>
@@ -9160,7 +9160,7 @@
                 <w:sz w:val="16"/>
                 <w:szCs w:val="16"/>
               </w:rPr>
-              <w:t xml:space="preserve">53,872</w:t>
+              <w:t xml:space="preserve">112,469</w:t>
             </w:r>
           </w:p>
         </w:tc>
@@ -9181,7 +9181,7 @@
                 <w:sz w:val="16"/>
                 <w:szCs w:val="16"/>
               </w:rPr>
-              <w:t xml:space="preserve">−15.6%</w:t>
+              <w:t xml:space="preserve">−55.9%</w:t>
             </w:r>
           </w:p>
         </w:tc>
@@ -9207,7 +9207,7 @@
                 <w:sz w:val="16"/>
                 <w:szCs w:val="16"/>
               </w:rPr>
-              <w:t xml:space="preserve">Cache-read tokens</w:t>
+              <w:t xml:space="preserve">Contract text cached</w:t>
             </w:r>
           </w:p>
         </w:tc>
@@ -9228,7 +9228,7 @@
                 <w:sz w:val="16"/>
                 <w:szCs w:val="16"/>
               </w:rPr>
-              <w:t xml:space="preserve">724,571</w:t>
+              <w:t xml:space="preserve">1,100,024</w:t>
             </w:r>
           </w:p>
         </w:tc>
@@ -9249,7 +9249,7 @@
                 <w:sz w:val="16"/>
                 <w:szCs w:val="16"/>
               </w:rPr>
-              <w:t xml:space="preserve">166,026</w:t>
+              <w:t xml:space="preserve">339,432</w:t>
             </w:r>
           </w:p>
         </w:tc>
@@ -9270,7 +9270,7 @@
                 <w:sz w:val="16"/>
                 <w:szCs w:val="16"/>
               </w:rPr>
-              <w:t xml:space="preserve">−77.1%</w:t>
+              <w:t xml:space="preserve">−69.1%</w:t>
             </w:r>
           </w:p>
         </w:tc>
@@ -9317,7 +9317,7 @@
                 <w:sz w:val="16"/>
                 <w:szCs w:val="16"/>
               </w:rPr>
-              <w:t xml:space="preserve">1,019.6</w:t>
+              <w:t xml:space="preserve">4,151</w:t>
             </w:r>
           </w:p>
         </w:tc>
@@ -9338,7 +9338,7 @@
                 <w:sz w:val="16"/>
                 <w:szCs w:val="16"/>
               </w:rPr>
-              <w:t xml:space="preserve">818.5</w:t>
+              <w:t xml:space="preserve">1,673</w:t>
             </w:r>
           </w:p>
         </w:tc>
@@ -9359,7 +9359,7 @@
                 <w:sz w:val="16"/>
                 <w:szCs w:val="16"/>
               </w:rPr>
-              <w:t xml:space="preserve">−19.7%</w:t>
+              <w:t xml:space="preserve">−59.7%</w:t>
             </w:r>
           </w:p>
         </w:tc>
@@ -9406,7 +9406,7 @@
                 <w:sz w:val="16"/>
                 <w:szCs w:val="16"/>
               </w:rPr>
-              <w:t xml:space="preserve">3.41</w:t>
+              <w:t xml:space="preserve">17.75</w:t>
             </w:r>
           </w:p>
         </w:tc>
@@ -9427,7 +9427,7 @@
                 <w:sz w:val="16"/>
                 <w:szCs w:val="16"/>
               </w:rPr>
-              <w:t xml:space="preserve">3.36</w:t>
+              <w:t xml:space="preserve">6.45</w:t>
             </w:r>
           </w:p>
         </w:tc>
@@ -9448,7 +9448,7 @@
                 <w:sz w:val="16"/>
                 <w:szCs w:val="16"/>
               </w:rPr>
-              <w:t xml:space="preserve">−1.4%</w:t>
+              <w:t xml:space="preserve">−63.7%</w:t>
             </w:r>
           </w:p>
         </w:tc>
@@ -9523,7 +9523,7 @@
                 <w:sz w:val="16"/>
                 <w:szCs w:val="16"/>
               </w:rPr>
-              <w:t xml:space="preserve">38.5%</w:t>
+              <w:t xml:space="preserve">0.365</w:t>
             </w:r>
           </w:p>
         </w:tc>
@@ -9544,7 +9544,7 @@
                 <w:sz w:val="16"/>
                 <w:szCs w:val="16"/>
               </w:rPr>
-              <w:t xml:space="preserve">41.4%</w:t>
+              <w:t xml:space="preserve">0.627</w:t>
             </w:r>
           </w:p>
         </w:tc>
@@ -9565,7 +9565,7 @@
                 <w:sz w:val="16"/>
                 <w:szCs w:val="16"/>
               </w:rPr>
-              <w:t xml:space="preserve">+2.9 pp</w:t>
+              <w:t xml:space="preserve">+0.262</w:t>
             </w:r>
           </w:p>
         </w:tc>
@@ -9612,7 +9612,7 @@
                 <w:sz w:val="16"/>
                 <w:szCs w:val="16"/>
               </w:rPr>
-              <w:t xml:space="preserve">47.9%</w:t>
+              <w:t xml:space="preserve">0.322</w:t>
             </w:r>
           </w:p>
         </w:tc>
@@ -9633,7 +9633,7 @@
                 <w:sz w:val="16"/>
                 <w:szCs w:val="16"/>
               </w:rPr>
-              <w:t xml:space="preserve">63.0%</w:t>
+              <w:t xml:space="preserve">0.775</w:t>
             </w:r>
           </w:p>
         </w:tc>
@@ -9654,7 +9654,7 @@
                 <w:sz w:val="16"/>
                 <w:szCs w:val="16"/>
               </w:rPr>
-              <w:t xml:space="preserve">+15.1 pp</w:t>
+              <w:t xml:space="preserve">+0.453</w:t>
             </w:r>
           </w:p>
         </w:tc>
@@ -9701,7 +9701,7 @@
                 <w:sz w:val="16"/>
                 <w:szCs w:val="16"/>
               </w:rPr>
-              <w:t xml:space="preserve">42.7%</w:t>
+              <w:t xml:space="preserve">0.342</w:t>
             </w:r>
           </w:p>
         </w:tc>
@@ -9722,7 +9722,7 @@
                 <w:sz w:val="16"/>
                 <w:szCs w:val="16"/>
               </w:rPr>
-              <w:t xml:space="preserve">50.0%</w:t>
+              <w:t xml:space="preserve">0.693</w:t>
             </w:r>
           </w:p>
         </w:tc>
@@ -9743,7 +9743,7 @@
                 <w:sz w:val="16"/>
                 <w:szCs w:val="16"/>
               </w:rPr>
-              <w:t xml:space="preserve">+7.3 pp</w:t>
+              <w:t xml:space="preserve">+0.351</w:t>
             </w:r>
           </w:p>
         </w:tc>
@@ -9790,7 +9790,7 @@
                 <w:sz w:val="16"/>
                 <w:szCs w:val="16"/>
               </w:rPr>
-              <w:t xml:space="preserve">0.145</w:t>
+              <w:t xml:space="preserve">0.097</w:t>
             </w:r>
           </w:p>
         </w:tc>
@@ -9811,7 +9811,7 @@
                 <w:sz w:val="16"/>
                 <w:szCs w:val="16"/>
               </w:rPr>
-              <w:t xml:space="preserve">0.220</w:t>
+              <w:t xml:space="preserve">0.549</w:t>
             </w:r>
           </w:p>
         </w:tc>
@@ -9832,7 +9832,7 @@
                 <w:sz w:val="16"/>
                 <w:szCs w:val="16"/>
               </w:rPr>
-              <w:t xml:space="preserve">+0.075</w:t>
+              <w:t xml:space="preserve">+0.452</w:t>
             </w:r>
           </w:p>
         </w:tc>
@@ -9879,7 +9879,7 @@
                 <w:sz w:val="16"/>
                 <w:szCs w:val="16"/>
               </w:rPr>
-              <w:t xml:space="preserve">61.8%</w:t>
+              <w:t xml:space="preserve">0.642</w:t>
             </w:r>
           </w:p>
         </w:tc>
@@ -9900,7 +9900,7 @@
                 <w:sz w:val="16"/>
                 <w:szCs w:val="16"/>
               </w:rPr>
-              <w:t xml:space="preserve">62.5%</w:t>
+              <w:t xml:space="preserve">0.801</w:t>
             </w:r>
           </w:p>
         </w:tc>
@@ -9921,7 +9921,7 @@
                 <w:sz w:val="16"/>
                 <w:szCs w:val="16"/>
               </w:rPr>
-              <w:t xml:space="preserve">+0.7 pp</w:t>
+              <w:t xml:space="preserve">+0.159</w:t>
             </w:r>
           </w:p>
         </w:tc>
@@ -9968,7 +9968,7 @@
                 <w:sz w:val="16"/>
                 <w:szCs w:val="16"/>
               </w:rPr>
-              <w:t xml:space="preserve">0</w:t>
+              <w:t xml:space="preserve">5/200</w:t>
             </w:r>
           </w:p>
         </w:tc>
@@ -9989,7 +9989,7 @@
                 <w:sz w:val="16"/>
                 <w:szCs w:val="16"/>
               </w:rPr>
-              <w:t xml:space="preserve">2</w:t>
+              <w:t xml:space="preserve">28/200</w:t>
             </w:r>
           </w:p>
         </w:tc>
@@ -10010,7 +10010,7 @@
                 <w:sz w:val="16"/>
                 <w:szCs w:val="16"/>
               </w:rPr>
-              <w:t xml:space="preserve">+2</w:t>
+              <w:t xml:space="preserve">+23</w:t>
             </w:r>
           </w:p>
         </w:tc>
@@ -10057,7 +10057,7 @@
                 <w:sz w:val="16"/>
                 <w:szCs w:val="16"/>
               </w:rPr>
-              <w:t xml:space="preserve">57</w:t>
+              <w:t xml:space="preserve">149</w:t>
             </w:r>
           </w:p>
         </w:tc>
@@ -10078,7 +10078,7 @@
                 <w:sz w:val="16"/>
                 <w:szCs w:val="16"/>
               </w:rPr>
-              <w:t xml:space="preserve">75</w:t>
+              <w:t xml:space="preserve">359</w:t>
             </w:r>
           </w:p>
         </w:tc>
@@ -10099,7 +10099,7 @@
                 <w:sz w:val="16"/>
                 <w:szCs w:val="16"/>
               </w:rPr>
-              <w:t xml:space="preserve">+18</w:t>
+              <w:t xml:space="preserve">+210</w:t>
             </w:r>
           </w:p>
         </w:tc>
@@ -10146,7 +10146,7 @@
                 <w:sz w:val="16"/>
                 <w:szCs w:val="16"/>
               </w:rPr>
-              <w:t xml:space="preserve">91</w:t>
+              <w:t xml:space="preserve">259</w:t>
             </w:r>
           </w:p>
         </w:tc>
@@ -10167,7 +10167,7 @@
                 <w:sz w:val="16"/>
                 <w:szCs w:val="16"/>
               </w:rPr>
-              <w:t xml:space="preserve">106</w:t>
+              <w:t xml:space="preserve">214</w:t>
             </w:r>
           </w:p>
         </w:tc>
@@ -10188,7 +10188,7 @@
                 <w:sz w:val="16"/>
                 <w:szCs w:val="16"/>
               </w:rPr>
-              <w:t xml:space="preserve">+15</w:t>
+              <w:t xml:space="preserve">−45</w:t>
             </w:r>
           </w:p>
         </w:tc>
@@ -10235,7 +10235,7 @@
                 <w:sz w:val="16"/>
                 <w:szCs w:val="16"/>
               </w:rPr>
-              <w:t xml:space="preserve">62</w:t>
+              <w:t xml:space="preserve">314</w:t>
             </w:r>
           </w:p>
         </w:tc>
@@ -10256,7 +10256,7 @@
                 <w:sz w:val="16"/>
                 <w:szCs w:val="16"/>
               </w:rPr>
-              <w:t xml:space="preserve">44</w:t>
+              <w:t xml:space="preserve">104</w:t>
             </w:r>
           </w:p>
         </w:tc>
@@ -10277,7 +10277,7 @@
                 <w:sz w:val="16"/>
                 <w:szCs w:val="16"/>
               </w:rPr>
-              <w:t xml:space="preserve">−18</w:t>
+              <w:t xml:space="preserve">−210</w:t>
             </w:r>
           </w:p>
         </w:tc>
@@ -10415,11 +10415,12 @@
         </w:tblCellMar>
       </w:tblPr>
       <w:tblGrid>
-        <w:gridCol w:w="1391"/>
-        <w:gridCol w:w="560"/>
-        <w:gridCol w:w="620"/>
-        <w:gridCol w:w="620"/>
-        <w:gridCol w:w="580"/>
+        <w:gridCol w:w="1251"/>
+        <w:gridCol w:w="520"/>
+        <w:gridCol w:w="520"/>
+        <w:gridCol w:w="520"/>
+        <w:gridCol w:w="480"/>
+        <w:gridCol w:w="480"/>
         <w:gridCol w:w="480"/>
         <w:gridCol w:w="480"/>
       </w:tblGrid>
@@ -10430,7 +10431,7 @@
         </w:trPr>
         <w:tc>
           <w:tcPr>
-            <w:tcW w:w="1391" w:type="dxa"/>
+            <w:tcW w:w="1251" w:type="dxa"/>
             <w:tcBorders>
               <w:bottom w:val="single" w:sz="8" w:space="0" w:color="000000"/>
             </w:tcBorders>
@@ -10455,7 +10456,7 @@
         </w:tc>
         <w:tc>
           <w:tcPr>
-            <w:tcW w:w="560" w:type="dxa"/>
+            <w:tcW w:w="520" w:type="dxa"/>
             <w:tcBorders>
               <w:bottom w:val="single" w:sz="8" w:space="0" w:color="000000"/>
             </w:tcBorders>
@@ -10480,7 +10481,7 @@
         </w:tc>
         <w:tc>
           <w:tcPr>
-            <w:tcW w:w="620" w:type="dxa"/>
+            <w:tcW w:w="520" w:type="dxa"/>
             <w:tcBorders>
               <w:bottom w:val="single" w:sz="8" w:space="0" w:color="000000"/>
             </w:tcBorders>
@@ -10499,13 +10500,13 @@
                 <w:sz w:val="16"/>
                 <w:szCs w:val="16"/>
               </w:rPr>
-              <w:t xml:space="preserve">Agr. A</w:t>
-            </w:r>
-          </w:p>
-        </w:tc>
-        <w:tc>
-          <w:tcPr>
-            <w:tcW w:w="620" w:type="dxa"/>
+              <w:t xml:space="preserve">F1 A</w:t>
+            </w:r>
+          </w:p>
+        </w:tc>
+        <w:tc>
+          <w:tcPr>
+            <w:tcW w:w="520" w:type="dxa"/>
             <w:tcBorders>
               <w:bottom w:val="single" w:sz="8" w:space="0" w:color="000000"/>
             </w:tcBorders>
@@ -10524,13 +10525,13 @@
                 <w:sz w:val="16"/>
                 <w:szCs w:val="16"/>
               </w:rPr>
-              <w:t xml:space="preserve">Agr. B</w:t>
-            </w:r>
-          </w:p>
-        </w:tc>
-        <w:tc>
-          <w:tcPr>
-            <w:tcW w:w="580" w:type="dxa"/>
+              <w:t xml:space="preserve">F1 B</w:t>
+            </w:r>
+          </w:p>
+        </w:tc>
+        <w:tc>
+          <w:tcPr>
+            <w:tcW w:w="480" w:type="dxa"/>
             <w:tcBorders>
               <w:bottom w:val="single" w:sz="8" w:space="0" w:color="000000"/>
             </w:tcBorders>
@@ -10549,7 +10550,32 @@
                 <w:sz w:val="16"/>
                 <w:szCs w:val="16"/>
               </w:rPr>
-              <w:t xml:space="preserve">Δ (pp)</w:t>
+              <w:t xml:space="preserve">FP A</w:t>
+            </w:r>
+          </w:p>
+        </w:tc>
+        <w:tc>
+          <w:tcPr>
+            <w:tcW w:w="480" w:type="dxa"/>
+            <w:tcBorders>
+              <w:bottom w:val="single" w:sz="8" w:space="0" w:color="000000"/>
+            </w:tcBorders>
+            <w:vAlign w:val="center"/>
+          </w:tcPr>
+          <w:p>
+            <w:pPr>
+              <w:widowControl/>
+              <w:spacing w:before="6" w:after="6" w:line="240" w:lineRule="auto"/>
+              <w:jc w:val="right"/>
+            </w:pPr>
+            <w:r>
+              <w:rPr>
+                <w:rFonts w:ascii="Times New Roman" w:hAnsi="Times New Roman" w:cs="Times New Roman"/>
+                <w:b/>
+                <w:sz w:val="16"/>
+                <w:szCs w:val="16"/>
+              </w:rPr>
+              <w:t xml:space="preserve">FP B</w:t>
             </w:r>
           </w:p>
         </w:tc>
@@ -10610,7 +10636,7 @@
         </w:trPr>
         <w:tc>
           <w:tcPr>
-            <w:tcW w:w="1391" w:type="dxa"/>
+            <w:tcW w:w="1251" w:type="dxa"/>
             <w:vAlign w:val="center"/>
           </w:tcPr>
           <w:p>
@@ -10631,85 +10657,64 @@
         </w:tc>
         <w:tc>
           <w:tcPr>
-            <w:tcW w:w="560" w:type="dxa"/>
-            <w:vAlign w:val="center"/>
-          </w:tcPr>
-          <w:p>
-            <w:pPr>
-              <w:widowControl/>
-              <w:spacing w:before="6" w:after="6" w:line="240" w:lineRule="auto"/>
-              <w:jc w:val="right"/>
-            </w:pPr>
-            <w:r>
-              <w:rPr>
-                <w:rFonts w:ascii="Times New Roman" w:hAnsi="Times New Roman" w:cs="Times New Roman"/>
-                <w:sz w:val="16"/>
-                <w:szCs w:val="16"/>
-              </w:rPr>
-              <w:t xml:space="preserve">22</w:t>
-            </w:r>
-          </w:p>
-        </w:tc>
-        <w:tc>
-          <w:tcPr>
-            <w:tcW w:w="620" w:type="dxa"/>
-            <w:vAlign w:val="center"/>
-          </w:tcPr>
-          <w:p>
-            <w:pPr>
-              <w:widowControl/>
-              <w:spacing w:before="6" w:after="6" w:line="240" w:lineRule="auto"/>
-              <w:jc w:val="right"/>
-            </w:pPr>
-            <w:r>
-              <w:rPr>
-                <w:rFonts w:ascii="Times New Roman" w:hAnsi="Times New Roman" w:cs="Times New Roman"/>
-                <w:sz w:val="16"/>
-                <w:szCs w:val="16"/>
-              </w:rPr>
-              <w:t xml:space="preserve">0.820</w:t>
-            </w:r>
-          </w:p>
-        </w:tc>
-        <w:tc>
-          <w:tcPr>
-            <w:tcW w:w="620" w:type="dxa"/>
-            <w:vAlign w:val="center"/>
-          </w:tcPr>
-          <w:p>
-            <w:pPr>
-              <w:widowControl/>
-              <w:spacing w:before="6" w:after="6" w:line="240" w:lineRule="auto"/>
-              <w:jc w:val="right"/>
-            </w:pPr>
-            <w:r>
-              <w:rPr>
-                <w:rFonts w:ascii="Times New Roman" w:hAnsi="Times New Roman" w:cs="Times New Roman"/>
-                <w:sz w:val="16"/>
-                <w:szCs w:val="16"/>
-              </w:rPr>
-              <w:t xml:space="preserve">0.860</w:t>
-            </w:r>
-          </w:p>
-        </w:tc>
-        <w:tc>
-          <w:tcPr>
-            <w:tcW w:w="580" w:type="dxa"/>
-            <w:vAlign w:val="center"/>
-          </w:tcPr>
-          <w:p>
-            <w:pPr>
-              <w:widowControl/>
-              <w:spacing w:before="6" w:after="6" w:line="240" w:lineRule="auto"/>
-              <w:jc w:val="right"/>
-            </w:pPr>
-            <w:r>
-              <w:rPr>
-                <w:rFonts w:ascii="Times New Roman" w:hAnsi="Times New Roman" w:cs="Times New Roman"/>
-                <w:sz w:val="16"/>
-                <w:szCs w:val="16"/>
-              </w:rPr>
-              <w:t xml:space="preserve">+4.0</w:t>
+            <w:tcW w:w="520" w:type="dxa"/>
+            <w:vAlign w:val="center"/>
+          </w:tcPr>
+          <w:p>
+            <w:pPr>
+              <w:widowControl/>
+              <w:spacing w:before="6" w:after="6" w:line="240" w:lineRule="auto"/>
+              <w:jc w:val="right"/>
+            </w:pPr>
+            <w:r>
+              <w:rPr>
+                <w:rFonts w:ascii="Times New Roman" w:hAnsi="Times New Roman" w:cs="Times New Roman"/>
+                <w:sz w:val="16"/>
+                <w:szCs w:val="16"/>
+              </w:rPr>
+              <w:t xml:space="preserve">98</w:t>
+            </w:r>
+          </w:p>
+        </w:tc>
+        <w:tc>
+          <w:tcPr>
+            <w:tcW w:w="520" w:type="dxa"/>
+            <w:vAlign w:val="center"/>
+          </w:tcPr>
+          <w:p>
+            <w:pPr>
+              <w:widowControl/>
+              <w:spacing w:before="6" w:after="6" w:line="240" w:lineRule="auto"/>
+              <w:jc w:val="right"/>
+            </w:pPr>
+            <w:r>
+              <w:rPr>
+                <w:rFonts w:ascii="Times New Roman" w:hAnsi="Times New Roman" w:cs="Times New Roman"/>
+                <w:sz w:val="16"/>
+                <w:szCs w:val="16"/>
+              </w:rPr>
+              <w:t xml:space="preserve">0.19</w:t>
+            </w:r>
+          </w:p>
+        </w:tc>
+        <w:tc>
+          <w:tcPr>
+            <w:tcW w:w="520" w:type="dxa"/>
+            <w:vAlign w:val="center"/>
+          </w:tcPr>
+          <w:p>
+            <w:pPr>
+              <w:widowControl/>
+              <w:spacing w:before="6" w:after="6" w:line="240" w:lineRule="auto"/>
+              <w:jc w:val="right"/>
+            </w:pPr>
+            <w:r>
+              <w:rPr>
+                <w:rFonts w:ascii="Times New Roman" w:hAnsi="Times New Roman" w:cs="Times New Roman"/>
+                <w:sz w:val="16"/>
+                <w:szCs w:val="16"/>
+              </w:rPr>
+              <w:t xml:space="preserve">0.82</w:t>
             </w:r>
           </w:p>
         </w:tc>
@@ -10730,7 +10735,7 @@
                 <w:sz w:val="16"/>
                 <w:szCs w:val="16"/>
               </w:rPr>
-              <w:t xml:space="preserve">4</w:t>
+              <w:t xml:space="preserve">0</w:t>
             </w:r>
           </w:p>
         </w:tc>
@@ -10751,7 +10756,49 @@
                 <w:sz w:val="16"/>
                 <w:szCs w:val="16"/>
               </w:rPr>
-              <w:t xml:space="preserve">1</w:t>
+              <w:t xml:space="preserve">39</w:t>
+            </w:r>
+          </w:p>
+        </w:tc>
+        <w:tc>
+          <w:tcPr>
+            <w:tcW w:w="480" w:type="dxa"/>
+            <w:vAlign w:val="center"/>
+          </w:tcPr>
+          <w:p>
+            <w:pPr>
+              <w:widowControl/>
+              <w:spacing w:before="6" w:after="6" w:line="240" w:lineRule="auto"/>
+              <w:jc w:val="right"/>
+            </w:pPr>
+            <w:r>
+              <w:rPr>
+                <w:rFonts w:ascii="Times New Roman" w:hAnsi="Times New Roman" w:cs="Times New Roman"/>
+                <w:sz w:val="16"/>
+                <w:szCs w:val="16"/>
+              </w:rPr>
+              <w:t xml:space="preserve">88</w:t>
+            </w:r>
+          </w:p>
+        </w:tc>
+        <w:tc>
+          <w:tcPr>
+            <w:tcW w:w="480" w:type="dxa"/>
+            <w:vAlign w:val="center"/>
+          </w:tcPr>
+          <w:p>
+            <w:pPr>
+              <w:widowControl/>
+              <w:spacing w:before="6" w:after="6" w:line="240" w:lineRule="auto"/>
+              <w:jc w:val="right"/>
+            </w:pPr>
+            <w:r>
+              <w:rPr>
+                <w:rFonts w:ascii="Times New Roman" w:hAnsi="Times New Roman" w:cs="Times New Roman"/>
+                <w:sz w:val="16"/>
+                <w:szCs w:val="16"/>
+              </w:rPr>
+              <w:t xml:space="preserve">2</w:t>
             </w:r>
           </w:p>
         </w:tc>
@@ -10762,7 +10809,7 @@
         </w:trPr>
         <w:tc>
           <w:tcPr>
-            <w:tcW w:w="1391" w:type="dxa"/>
+            <w:tcW w:w="1251" w:type="dxa"/>
             <w:vAlign w:val="center"/>
           </w:tcPr>
           <w:p>
@@ -10783,85 +10830,64 @@
         </w:tc>
         <w:tc>
           <w:tcPr>
-            <w:tcW w:w="560" w:type="dxa"/>
-            <w:vAlign w:val="center"/>
-          </w:tcPr>
-          <w:p>
-            <w:pPr>
-              <w:widowControl/>
-              <w:spacing w:before="6" w:after="6" w:line="240" w:lineRule="auto"/>
-              <w:jc w:val="right"/>
-            </w:pPr>
-            <w:r>
-              <w:rPr>
-                <w:rFonts w:ascii="Times New Roman" w:hAnsi="Times New Roman" w:cs="Times New Roman"/>
-                <w:sz w:val="16"/>
-                <w:szCs w:val="16"/>
-              </w:rPr>
-              <w:t xml:space="preserve">39</w:t>
-            </w:r>
-          </w:p>
-        </w:tc>
-        <w:tc>
-          <w:tcPr>
-            <w:tcW w:w="620" w:type="dxa"/>
-            <w:vAlign w:val="center"/>
-          </w:tcPr>
-          <w:p>
-            <w:pPr>
-              <w:widowControl/>
-              <w:spacing w:before="6" w:after="6" w:line="240" w:lineRule="auto"/>
-              <w:jc w:val="right"/>
-            </w:pPr>
-            <w:r>
-              <w:rPr>
-                <w:rFonts w:ascii="Times New Roman" w:hAnsi="Times New Roman" w:cs="Times New Roman"/>
-                <w:sz w:val="16"/>
-                <w:szCs w:val="16"/>
-              </w:rPr>
-              <w:t xml:space="preserve">0.340</w:t>
-            </w:r>
-          </w:p>
-        </w:tc>
-        <w:tc>
-          <w:tcPr>
-            <w:tcW w:w="620" w:type="dxa"/>
-            <w:vAlign w:val="center"/>
-          </w:tcPr>
-          <w:p>
-            <w:pPr>
-              <w:widowControl/>
-              <w:spacing w:before="6" w:after="6" w:line="240" w:lineRule="auto"/>
-              <w:jc w:val="right"/>
-            </w:pPr>
-            <w:r>
-              <w:rPr>
-                <w:rFonts w:ascii="Times New Roman" w:hAnsi="Times New Roman" w:cs="Times New Roman"/>
-                <w:sz w:val="16"/>
-                <w:szCs w:val="16"/>
-              </w:rPr>
-              <w:t xml:space="preserve">0.480</w:t>
-            </w:r>
-          </w:p>
-        </w:tc>
-        <w:tc>
-          <w:tcPr>
-            <w:tcW w:w="580" w:type="dxa"/>
-            <w:vAlign w:val="center"/>
-          </w:tcPr>
-          <w:p>
-            <w:pPr>
-              <w:widowControl/>
-              <w:spacing w:before="6" w:after="6" w:line="240" w:lineRule="auto"/>
-              <w:jc w:val="right"/>
-            </w:pPr>
-            <w:r>
-              <w:rPr>
-                <w:rFonts w:ascii="Times New Roman" w:hAnsi="Times New Roman" w:cs="Times New Roman"/>
-                <w:sz w:val="16"/>
-                <w:szCs w:val="16"/>
-              </w:rPr>
-              <w:t xml:space="preserve">+14.0</w:t>
+            <w:tcW w:w="520" w:type="dxa"/>
+            <w:vAlign w:val="center"/>
+          </w:tcPr>
+          <w:p>
+            <w:pPr>
+              <w:widowControl/>
+              <w:spacing w:before="6" w:after="6" w:line="240" w:lineRule="auto"/>
+              <w:jc w:val="right"/>
+            </w:pPr>
+            <w:r>
+              <w:rPr>
+                <w:rFonts w:ascii="Times New Roman" w:hAnsi="Times New Roman" w:cs="Times New Roman"/>
+                <w:sz w:val="16"/>
+                <w:szCs w:val="16"/>
+              </w:rPr>
+              <w:t xml:space="preserve">144</w:t>
+            </w:r>
+          </w:p>
+        </w:tc>
+        <w:tc>
+          <w:tcPr>
+            <w:tcW w:w="520" w:type="dxa"/>
+            <w:vAlign w:val="center"/>
+          </w:tcPr>
+          <w:p>
+            <w:pPr>
+              <w:widowControl/>
+              <w:spacing w:before="6" w:after="6" w:line="240" w:lineRule="auto"/>
+              <w:jc w:val="right"/>
+            </w:pPr>
+            <w:r>
+              <w:rPr>
+                <w:rFonts w:ascii="Times New Roman" w:hAnsi="Times New Roman" w:cs="Times New Roman"/>
+                <w:sz w:val="16"/>
+                <w:szCs w:val="16"/>
+              </w:rPr>
+              <w:t xml:space="preserve">0.41</w:t>
+            </w:r>
+          </w:p>
+        </w:tc>
+        <w:tc>
+          <w:tcPr>
+            <w:tcW w:w="520" w:type="dxa"/>
+            <w:vAlign w:val="center"/>
+          </w:tcPr>
+          <w:p>
+            <w:pPr>
+              <w:widowControl/>
+              <w:spacing w:before="6" w:after="6" w:line="240" w:lineRule="auto"/>
+              <w:jc w:val="right"/>
+            </w:pPr>
+            <w:r>
+              <w:rPr>
+                <w:rFonts w:ascii="Times New Roman" w:hAnsi="Times New Roman" w:cs="Times New Roman"/>
+                <w:sz w:val="16"/>
+                <w:szCs w:val="16"/>
+              </w:rPr>
+              <w:t xml:space="preserve">0.83</w:t>
             </w:r>
           </w:p>
         </w:tc>
@@ -10882,7 +10908,7 @@
                 <w:sz w:val="16"/>
                 <w:szCs w:val="16"/>
               </w:rPr>
-              <w:t xml:space="preserve">33</w:t>
+              <w:t xml:space="preserve">17</w:t>
             </w:r>
           </w:p>
         </w:tc>
@@ -10903,7 +10929,49 @@
                 <w:sz w:val="16"/>
                 <w:szCs w:val="16"/>
               </w:rPr>
-              <w:t xml:space="preserve">24</w:t>
+              <w:t xml:space="preserve">46</w:t>
+            </w:r>
+          </w:p>
+        </w:tc>
+        <w:tc>
+          <w:tcPr>
+            <w:tcW w:w="480" w:type="dxa"/>
+            <w:vAlign w:val="center"/>
+          </w:tcPr>
+          <w:p>
+            <w:pPr>
+              <w:widowControl/>
+              <w:spacing w:before="6" w:after="6" w:line="240" w:lineRule="auto"/>
+              <w:jc w:val="right"/>
+            </w:pPr>
+            <w:r>
+              <w:rPr>
+                <w:rFonts w:ascii="Times New Roman" w:hAnsi="Times New Roman" w:cs="Times New Roman"/>
+                <w:sz w:val="16"/>
+                <w:szCs w:val="16"/>
+              </w:rPr>
+              <w:t xml:space="preserve">102</w:t>
+            </w:r>
+          </w:p>
+        </w:tc>
+        <w:tc>
+          <w:tcPr>
+            <w:tcW w:w="480" w:type="dxa"/>
+            <w:vAlign w:val="center"/>
+          </w:tcPr>
+          <w:p>
+            <w:pPr>
+              <w:widowControl/>
+              <w:spacing w:before="6" w:after="6" w:line="240" w:lineRule="auto"/>
+              <w:jc w:val="right"/>
+            </w:pPr>
+            <w:r>
+              <w:rPr>
+                <w:rFonts w:ascii="Times New Roman" w:hAnsi="Times New Roman" w:cs="Times New Roman"/>
+                <w:sz w:val="16"/>
+                <w:szCs w:val="16"/>
+              </w:rPr>
+              <w:t xml:space="preserve">9</w:t>
             </w:r>
           </w:p>
         </w:tc>
@@ -10914,7 +10982,7 @@
         </w:trPr>
         <w:tc>
           <w:tcPr>
-            <w:tcW w:w="1391" w:type="dxa"/>
+            <w:tcW w:w="1251" w:type="dxa"/>
             <w:vAlign w:val="center"/>
           </w:tcPr>
           <w:p>
@@ -10935,85 +11003,64 @@
         </w:tc>
         <w:tc>
           <w:tcPr>
-            <w:tcW w:w="560" w:type="dxa"/>
-            <w:vAlign w:val="center"/>
-          </w:tcPr>
-          <w:p>
-            <w:pPr>
-              <w:widowControl/>
-              <w:spacing w:before="6" w:after="6" w:line="240" w:lineRule="auto"/>
-              <w:jc w:val="right"/>
-            </w:pPr>
-            <w:r>
-              <w:rPr>
-                <w:rFonts w:ascii="Times New Roman" w:hAnsi="Times New Roman" w:cs="Times New Roman"/>
-                <w:sz w:val="16"/>
-                <w:szCs w:val="16"/>
-              </w:rPr>
-              <w:t xml:space="preserve">23</w:t>
-            </w:r>
-          </w:p>
-        </w:tc>
-        <w:tc>
-          <w:tcPr>
-            <w:tcW w:w="620" w:type="dxa"/>
-            <w:vAlign w:val="center"/>
-          </w:tcPr>
-          <w:p>
-            <w:pPr>
-              <w:widowControl/>
-              <w:spacing w:before="6" w:after="6" w:line="240" w:lineRule="auto"/>
-              <w:jc w:val="right"/>
-            </w:pPr>
-            <w:r>
-              <w:rPr>
-                <w:rFonts w:ascii="Times New Roman" w:hAnsi="Times New Roman" w:cs="Times New Roman"/>
-                <w:sz w:val="16"/>
-                <w:szCs w:val="16"/>
-              </w:rPr>
-              <w:t xml:space="preserve">0.560</w:t>
-            </w:r>
-          </w:p>
-        </w:tc>
-        <w:tc>
-          <w:tcPr>
-            <w:tcW w:w="620" w:type="dxa"/>
-            <w:vAlign w:val="center"/>
-          </w:tcPr>
-          <w:p>
-            <w:pPr>
-              <w:widowControl/>
-              <w:spacing w:before="6" w:after="6" w:line="240" w:lineRule="auto"/>
-              <w:jc w:val="right"/>
-            </w:pPr>
-            <w:r>
-              <w:rPr>
-                <w:rFonts w:ascii="Times New Roman" w:hAnsi="Times New Roman" w:cs="Times New Roman"/>
-                <w:sz w:val="16"/>
-                <w:szCs w:val="16"/>
-              </w:rPr>
-              <w:t xml:space="preserve">0.540</w:t>
-            </w:r>
-          </w:p>
-        </w:tc>
-        <w:tc>
-          <w:tcPr>
-            <w:tcW w:w="580" w:type="dxa"/>
-            <w:vAlign w:val="center"/>
-          </w:tcPr>
-          <w:p>
-            <w:pPr>
-              <w:widowControl/>
-              <w:spacing w:before="6" w:after="6" w:line="240" w:lineRule="auto"/>
-              <w:jc w:val="right"/>
-            </w:pPr>
-            <w:r>
-              <w:rPr>
-                <w:rFonts w:ascii="Times New Roman" w:hAnsi="Times New Roman" w:cs="Times New Roman"/>
-                <w:sz w:val="16"/>
-                <w:szCs w:val="16"/>
-              </w:rPr>
-              <w:t xml:space="preserve">−2.0</w:t>
+            <w:tcW w:w="520" w:type="dxa"/>
+            <w:vAlign w:val="center"/>
+          </w:tcPr>
+          <w:p>
+            <w:pPr>
+              <w:widowControl/>
+              <w:spacing w:before="6" w:after="6" w:line="240" w:lineRule="auto"/>
+              <w:jc w:val="right"/>
+            </w:pPr>
+            <w:r>
+              <w:rPr>
+                <w:rFonts w:ascii="Times New Roman" w:hAnsi="Times New Roman" w:cs="Times New Roman"/>
+                <w:sz w:val="16"/>
+                <w:szCs w:val="16"/>
+              </w:rPr>
+              <w:t xml:space="preserve">84</w:t>
+            </w:r>
+          </w:p>
+        </w:tc>
+        <w:tc>
+          <w:tcPr>
+            <w:tcW w:w="520" w:type="dxa"/>
+            <w:vAlign w:val="center"/>
+          </w:tcPr>
+          <w:p>
+            <w:pPr>
+              <w:widowControl/>
+              <w:spacing w:before="6" w:after="6" w:line="240" w:lineRule="auto"/>
+              <w:jc w:val="right"/>
+            </w:pPr>
+            <w:r>
+              <w:rPr>
+                <w:rFonts w:ascii="Times New Roman" w:hAnsi="Times New Roman" w:cs="Times New Roman"/>
+                <w:sz w:val="16"/>
+                <w:szCs w:val="16"/>
+              </w:rPr>
+              <w:t xml:space="preserve">0.44</w:t>
+            </w:r>
+          </w:p>
+        </w:tc>
+        <w:tc>
+          <w:tcPr>
+            <w:tcW w:w="520" w:type="dxa"/>
+            <w:vAlign w:val="center"/>
+          </w:tcPr>
+          <w:p>
+            <w:pPr>
+              <w:widowControl/>
+              <w:spacing w:before="6" w:after="6" w:line="240" w:lineRule="auto"/>
+              <w:jc w:val="right"/>
+            </w:pPr>
+            <w:r>
+              <w:rPr>
+                <w:rFonts w:ascii="Times New Roman" w:hAnsi="Times New Roman" w:cs="Times New Roman"/>
+                <w:sz w:val="16"/>
+                <w:szCs w:val="16"/>
+              </w:rPr>
+              <w:t xml:space="preserve">0.52</w:t>
             </w:r>
           </w:p>
         </w:tc>
@@ -11034,7 +11081,7 @@
                 <w:sz w:val="16"/>
                 <w:szCs w:val="16"/>
               </w:rPr>
-              <w:t xml:space="preserve">14</w:t>
+              <w:t xml:space="preserve">25</w:t>
             </w:r>
           </w:p>
         </w:tc>
@@ -11055,7 +11102,49 @@
                 <w:sz w:val="16"/>
                 <w:szCs w:val="16"/>
               </w:rPr>
-              <w:t xml:space="preserve">12</w:t>
+              <w:t xml:space="preserve">48</w:t>
+            </w:r>
+          </w:p>
+        </w:tc>
+        <w:tc>
+          <w:tcPr>
+            <w:tcW w:w="480" w:type="dxa"/>
+            <w:vAlign w:val="center"/>
+          </w:tcPr>
+          <w:p>
+            <w:pPr>
+              <w:widowControl/>
+              <w:spacing w:before="6" w:after="6" w:line="240" w:lineRule="auto"/>
+              <w:jc w:val="right"/>
+            </w:pPr>
+            <w:r>
+              <w:rPr>
+                <w:rFonts w:ascii="Times New Roman" w:hAnsi="Times New Roman" w:cs="Times New Roman"/>
+                <w:sz w:val="16"/>
+                <w:szCs w:val="16"/>
+              </w:rPr>
+              <w:t xml:space="preserve">53</w:t>
+            </w:r>
+          </w:p>
+        </w:tc>
+        <w:tc>
+          <w:tcPr>
+            <w:tcW w:w="480" w:type="dxa"/>
+            <w:vAlign w:val="center"/>
+          </w:tcPr>
+          <w:p>
+            <w:pPr>
+              <w:widowControl/>
+              <w:spacing w:before="6" w:after="6" w:line="240" w:lineRule="auto"/>
+              <w:jc w:val="right"/>
+            </w:pPr>
+            <w:r>
+              <w:rPr>
+                <w:rFonts w:ascii="Times New Roman" w:hAnsi="Times New Roman" w:cs="Times New Roman"/>
+                <w:sz w:val="16"/>
+                <w:szCs w:val="16"/>
+              </w:rPr>
+              <w:t xml:space="preserve">38</w:t>
             </w:r>
           </w:p>
         </w:tc>
@@ -11066,7 +11155,7 @@
         </w:trPr>
         <w:tc>
           <w:tcPr>
-            <w:tcW w:w="1391" w:type="dxa"/>
+            <w:tcW w:w="1251" w:type="dxa"/>
             <w:vAlign w:val="center"/>
           </w:tcPr>
           <w:p>
@@ -11087,7 +11176,91 @@
         </w:tc>
         <w:tc>
           <w:tcPr>
-            <w:tcW w:w="560" w:type="dxa"/>
+            <w:tcW w:w="520" w:type="dxa"/>
+            <w:vAlign w:val="center"/>
+          </w:tcPr>
+          <w:p>
+            <w:pPr>
+              <w:widowControl/>
+              <w:spacing w:before="6" w:after="6" w:line="240" w:lineRule="auto"/>
+              <w:jc w:val="right"/>
+            </w:pPr>
+            <w:r>
+              <w:rPr>
+                <w:rFonts w:ascii="Times New Roman" w:hAnsi="Times New Roman" w:cs="Times New Roman"/>
+                <w:sz w:val="16"/>
+                <w:szCs w:val="16"/>
+              </w:rPr>
+              <w:t xml:space="preserve">38</w:t>
+            </w:r>
+          </w:p>
+        </w:tc>
+        <w:tc>
+          <w:tcPr>
+            <w:tcW w:w="520" w:type="dxa"/>
+            <w:vAlign w:val="center"/>
+          </w:tcPr>
+          <w:p>
+            <w:pPr>
+              <w:widowControl/>
+              <w:spacing w:before="6" w:after="6" w:line="240" w:lineRule="auto"/>
+              <w:jc w:val="right"/>
+            </w:pPr>
+            <w:r>
+              <w:rPr>
+                <w:rFonts w:ascii="Times New Roman" w:hAnsi="Times New Roman" w:cs="Times New Roman"/>
+                <w:sz w:val="16"/>
+                <w:szCs w:val="16"/>
+              </w:rPr>
+              <w:t xml:space="preserve">0.46</w:t>
+            </w:r>
+          </w:p>
+        </w:tc>
+        <w:tc>
+          <w:tcPr>
+            <w:tcW w:w="520" w:type="dxa"/>
+            <w:vAlign w:val="center"/>
+          </w:tcPr>
+          <w:p>
+            <w:pPr>
+              <w:widowControl/>
+              <w:spacing w:before="6" w:after="6" w:line="240" w:lineRule="auto"/>
+              <w:jc w:val="right"/>
+            </w:pPr>
+            <w:r>
+              <w:rPr>
+                <w:rFonts w:ascii="Times New Roman" w:hAnsi="Times New Roman" w:cs="Times New Roman"/>
+                <w:sz w:val="16"/>
+                <w:szCs w:val="16"/>
+              </w:rPr>
+              <w:t xml:space="preserve">0.74</w:t>
+            </w:r>
+          </w:p>
+        </w:tc>
+        <w:tc>
+          <w:tcPr>
+            <w:tcW w:w="480" w:type="dxa"/>
+            <w:vAlign w:val="center"/>
+          </w:tcPr>
+          <w:p>
+            <w:pPr>
+              <w:widowControl/>
+              <w:spacing w:before="6" w:after="6" w:line="240" w:lineRule="auto"/>
+              <w:jc w:val="right"/>
+            </w:pPr>
+            <w:r>
+              <w:rPr>
+                <w:rFonts w:ascii="Times New Roman" w:hAnsi="Times New Roman" w:cs="Times New Roman"/>
+                <w:sz w:val="16"/>
+                <w:szCs w:val="16"/>
+              </w:rPr>
+              <w:t xml:space="preserve">23</w:t>
+            </w:r>
+          </w:p>
+        </w:tc>
+        <w:tc>
+          <w:tcPr>
+            <w:tcW w:w="480" w:type="dxa"/>
             <w:vAlign w:val="center"/>
           </w:tcPr>
           <w:p>
@@ -11108,69 +11281,6 @@
         </w:tc>
         <w:tc>
           <w:tcPr>
-            <w:tcW w:w="620" w:type="dxa"/>
-            <w:vAlign w:val="center"/>
-          </w:tcPr>
-          <w:p>
-            <w:pPr>
-              <w:widowControl/>
-              <w:spacing w:before="6" w:after="6" w:line="240" w:lineRule="auto"/>
-              <w:jc w:val="right"/>
-            </w:pPr>
-            <w:r>
-              <w:rPr>
-                <w:rFonts w:ascii="Times New Roman" w:hAnsi="Times New Roman" w:cs="Times New Roman"/>
-                <w:sz w:val="16"/>
-                <w:szCs w:val="16"/>
-              </w:rPr>
-              <w:t xml:space="preserve">0.700</w:t>
-            </w:r>
-          </w:p>
-        </w:tc>
-        <w:tc>
-          <w:tcPr>
-            <w:tcW w:w="620" w:type="dxa"/>
-            <w:vAlign w:val="center"/>
-          </w:tcPr>
-          <w:p>
-            <w:pPr>
-              <w:widowControl/>
-              <w:spacing w:before="6" w:after="6" w:line="240" w:lineRule="auto"/>
-              <w:jc w:val="right"/>
-            </w:pPr>
-            <w:r>
-              <w:rPr>
-                <w:rFonts w:ascii="Times New Roman" w:hAnsi="Times New Roman" w:cs="Times New Roman"/>
-                <w:sz w:val="16"/>
-                <w:szCs w:val="16"/>
-              </w:rPr>
-              <w:t xml:space="preserve">0.700</w:t>
-            </w:r>
-          </w:p>
-        </w:tc>
-        <w:tc>
-          <w:tcPr>
-            <w:tcW w:w="580" w:type="dxa"/>
-            <w:vAlign w:val="center"/>
-          </w:tcPr>
-          <w:p>
-            <w:pPr>
-              <w:widowControl/>
-              <w:spacing w:before="6" w:after="6" w:line="240" w:lineRule="auto"/>
-              <w:jc w:val="right"/>
-            </w:pPr>
-            <w:r>
-              <w:rPr>
-                <w:rFonts w:ascii="Times New Roman" w:hAnsi="Times New Roman" w:cs="Times New Roman"/>
-                <w:sz w:val="16"/>
-                <w:szCs w:val="16"/>
-              </w:rPr>
-              <w:t xml:space="preserve">0.0</w:t>
-            </w:r>
-          </w:p>
-        </w:tc>
-        <w:tc>
-          <w:tcPr>
             <w:tcW w:w="480" w:type="dxa"/>
             <w:vAlign w:val="center"/>
           </w:tcPr>
@@ -11186,7 +11296,7 @@
                 <w:sz w:val="16"/>
                 <w:szCs w:val="16"/>
               </w:rPr>
-              <w:t xml:space="preserve">4</w:t>
+              <w:t xml:space="preserve">20</w:t>
             </w:r>
           </w:p>
         </w:tc>
@@ -11207,7 +11317,7 @@
                 <w:sz w:val="16"/>
                 <w:szCs w:val="16"/>
               </w:rPr>
-              <w:t xml:space="preserve">2</w:t>
+              <w:t xml:space="preserve">13</w:t>
             </w:r>
           </w:p>
         </w:tc>
@@ -11218,7 +11328,7 @@
         </w:trPr>
         <w:tc>
           <w:tcPr>
-            <w:tcW w:w="1391" w:type="dxa"/>
+            <w:tcW w:w="1251" w:type="dxa"/>
             <w:vAlign w:val="center"/>
           </w:tcPr>
           <w:p>
@@ -11239,85 +11349,64 @@
         </w:tc>
         <w:tc>
           <w:tcPr>
-            <w:tcW w:w="560" w:type="dxa"/>
-            <w:vAlign w:val="center"/>
-          </w:tcPr>
-          <w:p>
-            <w:pPr>
-              <w:widowControl/>
-              <w:spacing w:before="6" w:after="6" w:line="240" w:lineRule="auto"/>
-              <w:jc w:val="right"/>
-            </w:pPr>
-            <w:r>
-              <w:rPr>
-                <w:rFonts w:ascii="Times New Roman" w:hAnsi="Times New Roman" w:cs="Times New Roman"/>
-                <w:sz w:val="16"/>
-                <w:szCs w:val="16"/>
-              </w:rPr>
-              <w:t xml:space="preserve">7</w:t>
-            </w:r>
-          </w:p>
-        </w:tc>
-        <w:tc>
-          <w:tcPr>
-            <w:tcW w:w="620" w:type="dxa"/>
-            <w:vAlign w:val="center"/>
-          </w:tcPr>
-          <w:p>
-            <w:pPr>
-              <w:widowControl/>
-              <w:spacing w:before="6" w:after="6" w:line="240" w:lineRule="auto"/>
-              <w:jc w:val="right"/>
-            </w:pPr>
-            <w:r>
-              <w:rPr>
-                <w:rFonts w:ascii="Times New Roman" w:hAnsi="Times New Roman" w:cs="Times New Roman"/>
-                <w:sz w:val="16"/>
-                <w:szCs w:val="16"/>
-              </w:rPr>
-              <w:t xml:space="preserve">0.760</w:t>
-            </w:r>
-          </w:p>
-        </w:tc>
-        <w:tc>
-          <w:tcPr>
-            <w:tcW w:w="620" w:type="dxa"/>
-            <w:vAlign w:val="center"/>
-          </w:tcPr>
-          <w:p>
-            <w:pPr>
-              <w:widowControl/>
-              <w:spacing w:before="6" w:after="6" w:line="240" w:lineRule="auto"/>
-              <w:jc w:val="right"/>
-            </w:pPr>
-            <w:r>
-              <w:rPr>
-                <w:rFonts w:ascii="Times New Roman" w:hAnsi="Times New Roman" w:cs="Times New Roman"/>
-                <w:sz w:val="16"/>
-                <w:szCs w:val="16"/>
-              </w:rPr>
-              <w:t xml:space="preserve">0.620</w:t>
-            </w:r>
-          </w:p>
-        </w:tc>
-        <w:tc>
-          <w:tcPr>
-            <w:tcW w:w="580" w:type="dxa"/>
-            <w:vAlign w:val="center"/>
-          </w:tcPr>
-          <w:p>
-            <w:pPr>
-              <w:widowControl/>
-              <w:spacing w:before="6" w:after="6" w:line="240" w:lineRule="auto"/>
-              <w:jc w:val="right"/>
-            </w:pPr>
-            <w:r>
-              <w:rPr>
-                <w:rFonts w:ascii="Times New Roman" w:hAnsi="Times New Roman" w:cs="Times New Roman"/>
-                <w:sz w:val="16"/>
-                <w:szCs w:val="16"/>
-              </w:rPr>
-              <w:t xml:space="preserve">−14.0</w:t>
+            <w:tcW w:w="520" w:type="dxa"/>
+            <w:vAlign w:val="center"/>
+          </w:tcPr>
+          <w:p>
+            <w:pPr>
+              <w:widowControl/>
+              <w:spacing w:before="6" w:after="6" w:line="240" w:lineRule="auto"/>
+              <w:jc w:val="right"/>
+            </w:pPr>
+            <w:r>
+              <w:rPr>
+                <w:rFonts w:ascii="Times New Roman" w:hAnsi="Times New Roman" w:cs="Times New Roman"/>
+                <w:sz w:val="16"/>
+                <w:szCs w:val="16"/>
+              </w:rPr>
+              <w:t xml:space="preserve">26</w:t>
+            </w:r>
+          </w:p>
+        </w:tc>
+        <w:tc>
+          <w:tcPr>
+            <w:tcW w:w="520" w:type="dxa"/>
+            <w:vAlign w:val="center"/>
+          </w:tcPr>
+          <w:p>
+            <w:pPr>
+              <w:widowControl/>
+              <w:spacing w:before="6" w:after="6" w:line="240" w:lineRule="auto"/>
+              <w:jc w:val="right"/>
+            </w:pPr>
+            <w:r>
+              <w:rPr>
+                <w:rFonts w:ascii="Times New Roman" w:hAnsi="Times New Roman" w:cs="Times New Roman"/>
+                <w:sz w:val="16"/>
+                <w:szCs w:val="16"/>
+              </w:rPr>
+              <w:t xml:space="preserve">0.17</w:t>
+            </w:r>
+          </w:p>
+        </w:tc>
+        <w:tc>
+          <w:tcPr>
+            <w:tcW w:w="520" w:type="dxa"/>
+            <w:vAlign w:val="center"/>
+          </w:tcPr>
+          <w:p>
+            <w:pPr>
+              <w:widowControl/>
+              <w:spacing w:before="6" w:after="6" w:line="240" w:lineRule="auto"/>
+              <w:jc w:val="right"/>
+            </w:pPr>
+            <w:r>
+              <w:rPr>
+                <w:rFonts w:ascii="Times New Roman" w:hAnsi="Times New Roman" w:cs="Times New Roman"/>
+                <w:sz w:val="16"/>
+                <w:szCs w:val="16"/>
+              </w:rPr>
+              <w:t xml:space="preserve">0.47</w:t>
             </w:r>
           </w:p>
         </w:tc>
@@ -11338,7 +11427,7 @@
                 <w:sz w:val="16"/>
                 <w:szCs w:val="16"/>
               </w:rPr>
-              <w:t xml:space="preserve">3</w:t>
+              <w:t xml:space="preserve">50</w:t>
             </w:r>
           </w:p>
         </w:tc>
@@ -11359,7 +11448,49 @@
                 <w:sz w:val="16"/>
                 <w:szCs w:val="16"/>
               </w:rPr>
-              <w:t xml:space="preserve">3</w:t>
+              <w:t xml:space="preserve">10</w:t>
+            </w:r>
+          </w:p>
+        </w:tc>
+        <w:tc>
+          <w:tcPr>
+            <w:tcW w:w="480" w:type="dxa"/>
+            <w:vAlign w:val="center"/>
+          </w:tcPr>
+          <w:p>
+            <w:pPr>
+              <w:widowControl/>
+              <w:spacing w:before="6" w:after="6" w:line="240" w:lineRule="auto"/>
+              <w:jc w:val="right"/>
+            </w:pPr>
+            <w:r>
+              <w:rPr>
+                <w:rFonts w:ascii="Times New Roman" w:hAnsi="Times New Roman" w:cs="Times New Roman"/>
+                <w:sz w:val="16"/>
+                <w:szCs w:val="16"/>
+              </w:rPr>
+              <w:t xml:space="preserve">19</w:t>
+            </w:r>
+          </w:p>
+        </w:tc>
+        <w:tc>
+          <w:tcPr>
+            <w:tcW w:w="480" w:type="dxa"/>
+            <w:vAlign w:val="center"/>
+          </w:tcPr>
+          <w:p>
+            <w:pPr>
+              <w:widowControl/>
+              <w:spacing w:before="6" w:after="6" w:line="240" w:lineRule="auto"/>
+              <w:jc w:val="right"/>
+            </w:pPr>
+            <w:r>
+              <w:rPr>
+                <w:rFonts w:ascii="Times New Roman" w:hAnsi="Times New Roman" w:cs="Times New Roman"/>
+                <w:sz w:val="16"/>
+                <w:szCs w:val="16"/>
+              </w:rPr>
+              <w:t xml:space="preserve">15</w:t>
             </w:r>
           </w:p>
         </w:tc>
@@ -11370,7 +11501,7 @@
         </w:trPr>
         <w:tc>
           <w:tcPr>
-            <w:tcW w:w="1391" w:type="dxa"/>
+            <w:tcW w:w="1251" w:type="dxa"/>
             <w:vAlign w:val="center"/>
           </w:tcPr>
           <w:p>
@@ -11391,85 +11522,64 @@
         </w:tc>
         <w:tc>
           <w:tcPr>
-            <w:tcW w:w="560" w:type="dxa"/>
-            <w:vAlign w:val="center"/>
-          </w:tcPr>
-          <w:p>
-            <w:pPr>
-              <w:widowControl/>
-              <w:spacing w:before="6" w:after="6" w:line="240" w:lineRule="auto"/>
-              <w:jc w:val="right"/>
-            </w:pPr>
-            <w:r>
-              <w:rPr>
-                <w:rFonts w:ascii="Times New Roman" w:hAnsi="Times New Roman" w:cs="Times New Roman"/>
-                <w:sz w:val="16"/>
-                <w:szCs w:val="16"/>
-              </w:rPr>
-              <w:t xml:space="preserve">5</w:t>
-            </w:r>
-          </w:p>
-        </w:tc>
-        <w:tc>
-          <w:tcPr>
-            <w:tcW w:w="620" w:type="dxa"/>
-            <w:vAlign w:val="center"/>
-          </w:tcPr>
-          <w:p>
-            <w:pPr>
-              <w:widowControl/>
-              <w:spacing w:before="6" w:after="6" w:line="240" w:lineRule="auto"/>
-              <w:jc w:val="right"/>
-            </w:pPr>
-            <w:r>
-              <w:rPr>
-                <w:rFonts w:ascii="Times New Roman" w:hAnsi="Times New Roman" w:cs="Times New Roman"/>
-                <w:sz w:val="16"/>
-                <w:szCs w:val="16"/>
-              </w:rPr>
-              <w:t xml:space="preserve">0.960</w:t>
-            </w:r>
-          </w:p>
-        </w:tc>
-        <w:tc>
-          <w:tcPr>
-            <w:tcW w:w="620" w:type="dxa"/>
-            <w:vAlign w:val="center"/>
-          </w:tcPr>
-          <w:p>
-            <w:pPr>
-              <w:widowControl/>
-              <w:spacing w:before="6" w:after="6" w:line="240" w:lineRule="auto"/>
-              <w:jc w:val="right"/>
-            </w:pPr>
-            <w:r>
-              <w:rPr>
-                <w:rFonts w:ascii="Times New Roman" w:hAnsi="Times New Roman" w:cs="Times New Roman"/>
-                <w:sz w:val="16"/>
-                <w:szCs w:val="16"/>
-              </w:rPr>
-              <w:t xml:space="preserve">0.940</w:t>
-            </w:r>
-          </w:p>
-        </w:tc>
-        <w:tc>
-          <w:tcPr>
-            <w:tcW w:w="580" w:type="dxa"/>
-            <w:vAlign w:val="center"/>
-          </w:tcPr>
-          <w:p>
-            <w:pPr>
-              <w:widowControl/>
-              <w:spacing w:before="6" w:after="6" w:line="240" w:lineRule="auto"/>
-              <w:jc w:val="right"/>
-            </w:pPr>
-            <w:r>
-              <w:rPr>
-                <w:rFonts w:ascii="Times New Roman" w:hAnsi="Times New Roman" w:cs="Times New Roman"/>
-                <w:sz w:val="16"/>
-                <w:szCs w:val="16"/>
-              </w:rPr>
-              <w:t xml:space="preserve">−2.0</w:t>
+            <w:tcW w:w="520" w:type="dxa"/>
+            <w:vAlign w:val="center"/>
+          </w:tcPr>
+          <w:p>
+            <w:pPr>
+              <w:widowControl/>
+              <w:spacing w:before="6" w:after="6" w:line="240" w:lineRule="auto"/>
+              <w:jc w:val="right"/>
+            </w:pPr>
+            <w:r>
+              <w:rPr>
+                <w:rFonts w:ascii="Times New Roman" w:hAnsi="Times New Roman" w:cs="Times New Roman"/>
+                <w:sz w:val="16"/>
+                <w:szCs w:val="16"/>
+              </w:rPr>
+              <w:t xml:space="preserve">16</w:t>
+            </w:r>
+          </w:p>
+        </w:tc>
+        <w:tc>
+          <w:tcPr>
+            <w:tcW w:w="520" w:type="dxa"/>
+            <w:vAlign w:val="center"/>
+          </w:tcPr>
+          <w:p>
+            <w:pPr>
+              <w:widowControl/>
+              <w:spacing w:before="6" w:after="6" w:line="240" w:lineRule="auto"/>
+              <w:jc w:val="right"/>
+            </w:pPr>
+            <w:r>
+              <w:rPr>
+                <w:rFonts w:ascii="Times New Roman" w:hAnsi="Times New Roman" w:cs="Times New Roman"/>
+                <w:sz w:val="16"/>
+                <w:szCs w:val="16"/>
+              </w:rPr>
+              <w:t xml:space="preserve">0.58</w:t>
+            </w:r>
+          </w:p>
+        </w:tc>
+        <w:tc>
+          <w:tcPr>
+            <w:tcW w:w="520" w:type="dxa"/>
+            <w:vAlign w:val="center"/>
+          </w:tcPr>
+          <w:p>
+            <w:pPr>
+              <w:widowControl/>
+              <w:spacing w:before="6" w:after="6" w:line="240" w:lineRule="auto"/>
+              <w:jc w:val="right"/>
+            </w:pPr>
+            <w:r>
+              <w:rPr>
+                <w:rFonts w:ascii="Times New Roman" w:hAnsi="Times New Roman" w:cs="Times New Roman"/>
+                <w:sz w:val="16"/>
+                <w:szCs w:val="16"/>
+              </w:rPr>
+              <w:t xml:space="preserve">0.62</w:t>
             </w:r>
           </w:p>
         </w:tc>
@@ -11490,6 +11600,27 @@
                 <w:sz w:val="16"/>
                 <w:szCs w:val="16"/>
               </w:rPr>
+              <w:t xml:space="preserve">1</w:t>
+            </w:r>
+          </w:p>
+        </w:tc>
+        <w:tc>
+          <w:tcPr>
+            <w:tcW w:w="480" w:type="dxa"/>
+            <w:vAlign w:val="center"/>
+          </w:tcPr>
+          <w:p>
+            <w:pPr>
+              <w:widowControl/>
+              <w:spacing w:before="6" w:after="6" w:line="240" w:lineRule="auto"/>
+              <w:jc w:val="right"/>
+            </w:pPr>
+            <w:r>
+              <w:rPr>
+                <w:rFonts w:ascii="Times New Roman" w:hAnsi="Times New Roman" w:cs="Times New Roman"/>
+                <w:sz w:val="16"/>
+                <w:szCs w:val="16"/>
+              </w:rPr>
               <w:t xml:space="preserve">2</w:t>
             </w:r>
           </w:p>
@@ -11511,7 +11642,28 @@
                 <w:sz w:val="16"/>
                 <w:szCs w:val="16"/>
               </w:rPr>
-              <w:t xml:space="preserve">2</w:t>
+              <w:t xml:space="preserve">9</w:t>
+            </w:r>
+          </w:p>
+        </w:tc>
+        <w:tc>
+          <w:tcPr>
+            <w:tcW w:w="480" w:type="dxa"/>
+            <w:vAlign w:val="center"/>
+          </w:tcPr>
+          <w:p>
+            <w:pPr>
+              <w:widowControl/>
+              <w:spacing w:before="6" w:after="6" w:line="240" w:lineRule="auto"/>
+              <w:jc w:val="right"/>
+            </w:pPr>
+            <w:r>
+              <w:rPr>
+                <w:rFonts w:ascii="Times New Roman" w:hAnsi="Times New Roman" w:cs="Times New Roman"/>
+                <w:sz w:val="16"/>
+                <w:szCs w:val="16"/>
+              </w:rPr>
+              <w:t xml:space="preserve">8</w:t>
             </w:r>
           </w:p>
         </w:tc>
@@ -11522,7 +11674,7 @@
         </w:trPr>
         <w:tc>
           <w:tcPr>
-            <w:tcW w:w="1391" w:type="dxa"/>
+            <w:tcW w:w="1251" w:type="dxa"/>
             <w:vAlign w:val="center"/>
           </w:tcPr>
           <w:p>
@@ -11543,85 +11695,64 @@
         </w:tc>
         <w:tc>
           <w:tcPr>
-            <w:tcW w:w="560" w:type="dxa"/>
-            <w:vAlign w:val="center"/>
-          </w:tcPr>
-          <w:p>
-            <w:pPr>
-              <w:widowControl/>
-              <w:spacing w:before="6" w:after="6" w:line="240" w:lineRule="auto"/>
-              <w:jc w:val="right"/>
-            </w:pPr>
-            <w:r>
-              <w:rPr>
-                <w:rFonts w:ascii="Times New Roman" w:hAnsi="Times New Roman" w:cs="Times New Roman"/>
-                <w:sz w:val="16"/>
-                <w:szCs w:val="16"/>
-              </w:rPr>
-              <w:t xml:space="preserve">5</w:t>
-            </w:r>
-          </w:p>
-        </w:tc>
-        <w:tc>
-          <w:tcPr>
-            <w:tcW w:w="620" w:type="dxa"/>
-            <w:vAlign w:val="center"/>
-          </w:tcPr>
-          <w:p>
-            <w:pPr>
-              <w:widowControl/>
-              <w:spacing w:before="6" w:after="6" w:line="240" w:lineRule="auto"/>
-              <w:jc w:val="right"/>
-            </w:pPr>
-            <w:r>
-              <w:rPr>
-                <w:rFonts w:ascii="Times New Roman" w:hAnsi="Times New Roman" w:cs="Times New Roman"/>
-                <w:sz w:val="16"/>
-                <w:szCs w:val="16"/>
-              </w:rPr>
-              <w:t xml:space="preserve">0.100</w:t>
-            </w:r>
-          </w:p>
-        </w:tc>
-        <w:tc>
-          <w:tcPr>
-            <w:tcW w:w="620" w:type="dxa"/>
-            <w:vAlign w:val="center"/>
-          </w:tcPr>
-          <w:p>
-            <w:pPr>
-              <w:widowControl/>
-              <w:spacing w:before="6" w:after="6" w:line="240" w:lineRule="auto"/>
-              <w:jc w:val="right"/>
-            </w:pPr>
-            <w:r>
-              <w:rPr>
-                <w:rFonts w:ascii="Times New Roman" w:hAnsi="Times New Roman" w:cs="Times New Roman"/>
-                <w:sz w:val="16"/>
-                <w:szCs w:val="16"/>
-              </w:rPr>
-              <w:t xml:space="preserve">0.160</w:t>
-            </w:r>
-          </w:p>
-        </w:tc>
-        <w:tc>
-          <w:tcPr>
-            <w:tcW w:w="580" w:type="dxa"/>
-            <w:vAlign w:val="center"/>
-          </w:tcPr>
-          <w:p>
-            <w:pPr>
-              <w:widowControl/>
-              <w:spacing w:before="6" w:after="6" w:line="240" w:lineRule="auto"/>
-              <w:jc w:val="right"/>
-            </w:pPr>
-            <w:r>
-              <w:rPr>
-                <w:rFonts w:ascii="Times New Roman" w:hAnsi="Times New Roman" w:cs="Times New Roman"/>
-                <w:sz w:val="16"/>
-                <w:szCs w:val="16"/>
-              </w:rPr>
-              <w:t xml:space="preserve">+6.0</w:t>
+            <w:tcW w:w="520" w:type="dxa"/>
+            <w:vAlign w:val="center"/>
+          </w:tcPr>
+          <w:p>
+            <w:pPr>
+              <w:widowControl/>
+              <w:spacing w:before="6" w:after="6" w:line="240" w:lineRule="auto"/>
+              <w:jc w:val="right"/>
+            </w:pPr>
+            <w:r>
+              <w:rPr>
+                <w:rFonts w:ascii="Times New Roman" w:hAnsi="Times New Roman" w:cs="Times New Roman"/>
+                <w:sz w:val="16"/>
+                <w:szCs w:val="16"/>
+              </w:rPr>
+              <w:t xml:space="preserve">15</w:t>
+            </w:r>
+          </w:p>
+        </w:tc>
+        <w:tc>
+          <w:tcPr>
+            <w:tcW w:w="520" w:type="dxa"/>
+            <w:vAlign w:val="center"/>
+          </w:tcPr>
+          <w:p>
+            <w:pPr>
+              <w:widowControl/>
+              <w:spacing w:before="6" w:after="6" w:line="240" w:lineRule="auto"/>
+              <w:jc w:val="right"/>
+            </w:pPr>
+            <w:r>
+              <w:rPr>
+                <w:rFonts w:ascii="Times New Roman" w:hAnsi="Times New Roman" w:cs="Times New Roman"/>
+                <w:sz w:val="16"/>
+                <w:szCs w:val="16"/>
+              </w:rPr>
+              <w:t xml:space="preserve">0.09</w:t>
+            </w:r>
+          </w:p>
+        </w:tc>
+        <w:tc>
+          <w:tcPr>
+            <w:tcW w:w="520" w:type="dxa"/>
+            <w:vAlign w:val="center"/>
+          </w:tcPr>
+          <w:p>
+            <w:pPr>
+              <w:widowControl/>
+              <w:spacing w:before="6" w:after="6" w:line="240" w:lineRule="auto"/>
+              <w:jc w:val="right"/>
+            </w:pPr>
+            <w:r>
+              <w:rPr>
+                <w:rFonts w:ascii="Times New Roman" w:hAnsi="Times New Roman" w:cs="Times New Roman"/>
+                <w:sz w:val="16"/>
+                <w:szCs w:val="16"/>
+              </w:rPr>
+              <w:t xml:space="preserve">0.00</w:t>
             </w:r>
           </w:p>
         </w:tc>
@@ -11642,7 +11773,7 @@
                 <w:sz w:val="16"/>
                 <w:szCs w:val="16"/>
               </w:rPr>
-              <w:t xml:space="preserve">2</w:t>
+              <w:t xml:space="preserve">132</w:t>
             </w:r>
           </w:p>
         </w:tc>
@@ -11663,7 +11794,49 @@
                 <w:sz w:val="16"/>
                 <w:szCs w:val="16"/>
               </w:rPr>
-              <w:t xml:space="preserve">0</w:t>
+              <w:t xml:space="preserve">14</w:t>
+            </w:r>
+          </w:p>
+        </w:tc>
+        <w:tc>
+          <w:tcPr>
+            <w:tcW w:w="480" w:type="dxa"/>
+            <w:vAlign w:val="center"/>
+          </w:tcPr>
+          <w:p>
+            <w:pPr>
+              <w:widowControl/>
+              <w:spacing w:before="6" w:after="6" w:line="240" w:lineRule="auto"/>
+              <w:jc w:val="right"/>
+            </w:pPr>
+            <w:r>
+              <w:rPr>
+                <w:rFonts w:ascii="Times New Roman" w:hAnsi="Times New Roman" w:cs="Times New Roman"/>
+                <w:sz w:val="16"/>
+                <w:szCs w:val="16"/>
+              </w:rPr>
+              <w:t xml:space="preserve">8</w:t>
+            </w:r>
+          </w:p>
+        </w:tc>
+        <w:tc>
+          <w:tcPr>
+            <w:tcW w:w="480" w:type="dxa"/>
+            <w:vAlign w:val="center"/>
+          </w:tcPr>
+          <w:p>
+            <w:pPr>
+              <w:widowControl/>
+              <w:spacing w:before="6" w:after="6" w:line="240" w:lineRule="auto"/>
+              <w:jc w:val="right"/>
+            </w:pPr>
+            <w:r>
+              <w:rPr>
+                <w:rFonts w:ascii="Times New Roman" w:hAnsi="Times New Roman" w:cs="Times New Roman"/>
+                <w:sz w:val="16"/>
+                <w:szCs w:val="16"/>
+              </w:rPr>
+              <w:t xml:space="preserve">15</w:t>
             </w:r>
           </w:p>
         </w:tc>
@@ -11674,7 +11847,7 @@
         </w:trPr>
         <w:tc>
           <w:tcPr>
-            <w:tcW w:w="1391" w:type="dxa"/>
+            <w:tcW w:w="1251" w:type="dxa"/>
             <w:vAlign w:val="center"/>
           </w:tcPr>
           <w:p>
@@ -11695,85 +11868,64 @@
         </w:tc>
         <w:tc>
           <w:tcPr>
-            <w:tcW w:w="560" w:type="dxa"/>
-            <w:vAlign w:val="center"/>
-          </w:tcPr>
-          <w:p>
-            <w:pPr>
-              <w:widowControl/>
-              <w:spacing w:before="6" w:after="6" w:line="240" w:lineRule="auto"/>
-              <w:jc w:val="right"/>
-            </w:pPr>
-            <w:r>
-              <w:rPr>
-                <w:rFonts w:ascii="Times New Roman" w:hAnsi="Times New Roman" w:cs="Times New Roman"/>
-                <w:sz w:val="16"/>
-                <w:szCs w:val="16"/>
-              </w:rPr>
-              <w:t xml:space="preserve">13</w:t>
-            </w:r>
-          </w:p>
-        </w:tc>
-        <w:tc>
-          <w:tcPr>
-            <w:tcW w:w="620" w:type="dxa"/>
-            <w:vAlign w:val="center"/>
-          </w:tcPr>
-          <w:p>
-            <w:pPr>
-              <w:widowControl/>
-              <w:spacing w:before="6" w:after="6" w:line="240" w:lineRule="auto"/>
-              <w:jc w:val="right"/>
-            </w:pPr>
-            <w:r>
-              <w:rPr>
-                <w:rFonts w:ascii="Times New Roman" w:hAnsi="Times New Roman" w:cs="Times New Roman"/>
-                <w:sz w:val="16"/>
-                <w:szCs w:val="16"/>
-              </w:rPr>
-              <w:t xml:space="preserve">0.700</w:t>
-            </w:r>
-          </w:p>
-        </w:tc>
-        <w:tc>
-          <w:tcPr>
-            <w:tcW w:w="620" w:type="dxa"/>
-            <w:vAlign w:val="center"/>
-          </w:tcPr>
-          <w:p>
-            <w:pPr>
-              <w:widowControl/>
-              <w:spacing w:before="6" w:after="6" w:line="240" w:lineRule="auto"/>
-              <w:jc w:val="right"/>
-            </w:pPr>
-            <w:r>
-              <w:rPr>
-                <w:rFonts w:ascii="Times New Roman" w:hAnsi="Times New Roman" w:cs="Times New Roman"/>
-                <w:sz w:val="16"/>
-                <w:szCs w:val="16"/>
-              </w:rPr>
-              <w:t xml:space="preserve">0.700</w:t>
-            </w:r>
-          </w:p>
-        </w:tc>
-        <w:tc>
-          <w:tcPr>
-            <w:tcW w:w="580" w:type="dxa"/>
-            <w:vAlign w:val="center"/>
-          </w:tcPr>
-          <w:p>
-            <w:pPr>
-              <w:widowControl/>
-              <w:spacing w:before="6" w:after="6" w:line="240" w:lineRule="auto"/>
-              <w:jc w:val="right"/>
-            </w:pPr>
-            <w:r>
-              <w:rPr>
-                <w:rFonts w:ascii="Times New Roman" w:hAnsi="Times New Roman" w:cs="Times New Roman"/>
-                <w:sz w:val="16"/>
-                <w:szCs w:val="16"/>
-              </w:rPr>
-              <w:t xml:space="preserve">0.0</w:t>
+            <w:tcW w:w="520" w:type="dxa"/>
+            <w:vAlign w:val="center"/>
+          </w:tcPr>
+          <w:p>
+            <w:pPr>
+              <w:widowControl/>
+              <w:spacing w:before="6" w:after="6" w:line="240" w:lineRule="auto"/>
+              <w:jc w:val="right"/>
+            </w:pPr>
+            <w:r>
+              <w:rPr>
+                <w:rFonts w:ascii="Times New Roman" w:hAnsi="Times New Roman" w:cs="Times New Roman"/>
+                <w:sz w:val="16"/>
+                <w:szCs w:val="16"/>
+              </w:rPr>
+              <w:t xml:space="preserve">42</w:t>
+            </w:r>
+          </w:p>
+        </w:tc>
+        <w:tc>
+          <w:tcPr>
+            <w:tcW w:w="520" w:type="dxa"/>
+            <w:vAlign w:val="center"/>
+          </w:tcPr>
+          <w:p>
+            <w:pPr>
+              <w:widowControl/>
+              <w:spacing w:before="6" w:after="6" w:line="240" w:lineRule="auto"/>
+              <w:jc w:val="right"/>
+            </w:pPr>
+            <w:r>
+              <w:rPr>
+                <w:rFonts w:ascii="Times New Roman" w:hAnsi="Times New Roman" w:cs="Times New Roman"/>
+                <w:sz w:val="16"/>
+                <w:szCs w:val="16"/>
+              </w:rPr>
+              <w:t xml:space="preserve">0.67</w:t>
+            </w:r>
+          </w:p>
+        </w:tc>
+        <w:tc>
+          <w:tcPr>
+            <w:tcW w:w="520" w:type="dxa"/>
+            <w:vAlign w:val="center"/>
+          </w:tcPr>
+          <w:p>
+            <w:pPr>
+              <w:widowControl/>
+              <w:spacing w:before="6" w:after="6" w:line="240" w:lineRule="auto"/>
+              <w:jc w:val="right"/>
+            </w:pPr>
+            <w:r>
+              <w:rPr>
+                <w:rFonts w:ascii="Times New Roman" w:hAnsi="Times New Roman" w:cs="Times New Roman"/>
+                <w:sz w:val="16"/>
+                <w:szCs w:val="16"/>
+              </w:rPr>
+              <w:t xml:space="preserve">0.58</w:t>
             </w:r>
           </w:p>
         </w:tc>
@@ -11794,7 +11946,7 @@
                 <w:sz w:val="16"/>
                 <w:szCs w:val="16"/>
               </w:rPr>
-              <w:t xml:space="preserve">0</w:t>
+              <w:t xml:space="preserve">11</w:t>
             </w:r>
           </w:p>
         </w:tc>
@@ -11815,7 +11967,49 @@
                 <w:sz w:val="16"/>
                 <w:szCs w:val="16"/>
               </w:rPr>
-              <w:t xml:space="preserve">0</w:t>
+              <w:t xml:space="preserve">50</w:t>
+            </w:r>
+          </w:p>
+        </w:tc>
+        <w:tc>
+          <w:tcPr>
+            <w:tcW w:w="480" w:type="dxa"/>
+            <w:vAlign w:val="center"/>
+          </w:tcPr>
+          <w:p>
+            <w:pPr>
+              <w:widowControl/>
+              <w:spacing w:before="6" w:after="6" w:line="240" w:lineRule="auto"/>
+              <w:jc w:val="right"/>
+            </w:pPr>
+            <w:r>
+              <w:rPr>
+                <w:rFonts w:ascii="Times New Roman" w:hAnsi="Times New Roman" w:cs="Times New Roman"/>
+                <w:sz w:val="16"/>
+                <w:szCs w:val="16"/>
+              </w:rPr>
+              <w:t xml:space="preserve">15</w:t>
+            </w:r>
+          </w:p>
+        </w:tc>
+        <w:tc>
+          <w:tcPr>
+            <w:tcW w:w="480" w:type="dxa"/>
+            <w:vAlign w:val="center"/>
+          </w:tcPr>
+          <w:p>
+            <w:pPr>
+              <w:widowControl/>
+              <w:spacing w:before="6" w:after="6" w:line="240" w:lineRule="auto"/>
+              <w:jc w:val="right"/>
+            </w:pPr>
+            <w:r>
+              <w:rPr>
+                <w:rFonts w:ascii="Times New Roman" w:hAnsi="Times New Roman" w:cs="Times New Roman"/>
+                <w:sz w:val="16"/>
+                <w:szCs w:val="16"/>
+              </w:rPr>
+              <w:t xml:space="preserve">4</w:t>
             </w:r>
           </w:p>
         </w:tc>
@@ -11826,7 +12020,7 @@
         </w:trPr>
         <w:tc>
           <w:tcPr>
-            <w:tcW w:w="1391" w:type="dxa"/>
+            <w:tcW w:w="1251" w:type="dxa"/>
             <w:tcBorders>
               <w:top w:val="single" w:sz="8" w:space="0" w:color="000000"/>
             </w:tcBorders>
@@ -11851,7 +12045,7 @@
         </w:tc>
         <w:tc>
           <w:tcPr>
-            <w:tcW w:w="560" w:type="dxa"/>
+            <w:tcW w:w="520" w:type="dxa"/>
             <w:tcBorders>
               <w:top w:val="single" w:sz="8" w:space="0" w:color="000000"/>
             </w:tcBorders>
@@ -11870,13 +12064,13 @@
                 <w:sz w:val="16"/>
                 <w:szCs w:val="16"/>
               </w:rPr>
-              <w:t xml:space="preserve">119</w:t>
-            </w:r>
-          </w:p>
-        </w:tc>
-        <w:tc>
-          <w:tcPr>
-            <w:tcW w:w="620" w:type="dxa"/>
+              <w:t xml:space="preserve">463</w:t>
+            </w:r>
+          </w:p>
+        </w:tc>
+        <w:tc>
+          <w:tcPr>
+            <w:tcW w:w="520" w:type="dxa"/>
             <w:tcBorders>
               <w:top w:val="single" w:sz="8" w:space="0" w:color="000000"/>
             </w:tcBorders>
@@ -11895,13 +12089,13 @@
                 <w:sz w:val="16"/>
                 <w:szCs w:val="16"/>
               </w:rPr>
-              <w:t xml:space="preserve">0.618</w:t>
-            </w:r>
-          </w:p>
-        </w:tc>
-        <w:tc>
-          <w:tcPr>
-            <w:tcW w:w="620" w:type="dxa"/>
+              <w:t xml:space="preserve">0.342</w:t>
+            </w:r>
+          </w:p>
+        </w:tc>
+        <w:tc>
+          <w:tcPr>
+            <w:tcW w:w="520" w:type="dxa"/>
             <w:tcBorders>
               <w:top w:val="single" w:sz="8" w:space="0" w:color="000000"/>
             </w:tcBorders>
@@ -11920,32 +12114,7 @@
                 <w:sz w:val="16"/>
                 <w:szCs w:val="16"/>
               </w:rPr>
-              <w:t xml:space="preserve">0.625</w:t>
-            </w:r>
-          </w:p>
-        </w:tc>
-        <w:tc>
-          <w:tcPr>
-            <w:tcW w:w="580" w:type="dxa"/>
-            <w:tcBorders>
-              <w:top w:val="single" w:sz="8" w:space="0" w:color="000000"/>
-            </w:tcBorders>
-            <w:vAlign w:val="center"/>
-          </w:tcPr>
-          <w:p>
-            <w:pPr>
-              <w:widowControl/>
-              <w:spacing w:before="6" w:after="6" w:line="240" w:lineRule="auto"/>
-              <w:jc w:val="right"/>
-            </w:pPr>
-            <w:r>
-              <w:rPr>
-                <w:rFonts w:ascii="Times New Roman" w:hAnsi="Times New Roman" w:cs="Times New Roman"/>
-                <w:b/>
-                <w:sz w:val="16"/>
-                <w:szCs w:val="16"/>
-              </w:rPr>
-              <w:t xml:space="preserve">+0.7</w:t>
+              <w:t xml:space="preserve">0.693</w:t>
             </w:r>
           </w:p>
         </w:tc>
@@ -11970,7 +12139,7 @@
                 <w:sz w:val="16"/>
                 <w:szCs w:val="16"/>
               </w:rPr>
-              <w:t xml:space="preserve">62</w:t>
+              <w:t xml:space="preserve">259</w:t>
             </w:r>
           </w:p>
         </w:tc>
@@ -11995,7 +12164,57 @@
                 <w:sz w:val="16"/>
                 <w:szCs w:val="16"/>
               </w:rPr>
-              <w:t xml:space="preserve">44</w:t>
+              <w:t xml:space="preserve">214</w:t>
+            </w:r>
+          </w:p>
+        </w:tc>
+        <w:tc>
+          <w:tcPr>
+            <w:tcW w:w="480" w:type="dxa"/>
+            <w:tcBorders>
+              <w:top w:val="single" w:sz="8" w:space="0" w:color="000000"/>
+            </w:tcBorders>
+            <w:vAlign w:val="center"/>
+          </w:tcPr>
+          <w:p>
+            <w:pPr>
+              <w:widowControl/>
+              <w:spacing w:before="6" w:after="6" w:line="240" w:lineRule="auto"/>
+              <w:jc w:val="right"/>
+            </w:pPr>
+            <w:r>
+              <w:rPr>
+                <w:rFonts w:ascii="Times New Roman" w:hAnsi="Times New Roman" w:cs="Times New Roman"/>
+                <w:b/>
+                <w:sz w:val="16"/>
+                <w:szCs w:val="16"/>
+              </w:rPr>
+              <w:t xml:space="preserve">314</w:t>
+            </w:r>
+          </w:p>
+        </w:tc>
+        <w:tc>
+          <w:tcPr>
+            <w:tcW w:w="480" w:type="dxa"/>
+            <w:tcBorders>
+              <w:top w:val="single" w:sz="8" w:space="0" w:color="000000"/>
+            </w:tcBorders>
+            <w:vAlign w:val="center"/>
+          </w:tcPr>
+          <w:p>
+            <w:pPr>
+              <w:widowControl/>
+              <w:spacing w:before="6" w:after="6" w:line="240" w:lineRule="auto"/>
+              <w:jc w:val="right"/>
+            </w:pPr>
+            <w:r>
+              <w:rPr>
+                <w:rFonts w:ascii="Times New Roman" w:hAnsi="Times New Roman" w:cs="Times New Roman"/>
+                <w:b/>
+                <w:sz w:val="16"/>
+                <w:szCs w:val="16"/>
+              </w:rPr>
+              <w:t xml:space="preserve">104</w:t>
             </w:r>
           </w:p>
         </w:tc>
@@ -12013,7 +12232,7 @@
           <w:sz w:val="14"/>
           <w:szCs w:val="14"/>
         </w:rPr>
-        <w:t xml:space="preserve">DIVE+: reference positives; Agr.: label agreement; Δ: change in agreement; FN: false negatives.</w:t>
+        <w:t xml:space="preserve">DIVE+: reference positives; A: complete source with the simple prompt; B: AnchorSlice with the calibrated prompt; FP/FN: false positives and false negatives.</w:t>
       </w:r>
     </w:p>
     <w:p>

</xml_diff>

<commit_message>
Redraw the manuscript figures from the 200-contract results
- make_figures.py draws the pipeline, per-category F1 and resource figures
- both manuscripts use the redrawn figures; the journal version gains Fig. 3
- archive the superseded docx generator under results/exploration/

Co-Authored-By: Claude Opus 5 <noreply@anthropic.com>
</commit_message>
<xml_diff>
--- a/manuscript_conference/AnchorSlice_conference.docx
+++ b/manuscript_conference/AnchorSlice_conference.docx
@@ -2162,7 +2162,7 @@
       <w:r>
         <w:drawing>
           <wp:inline distT="0" distB="0" distL="0" distR="0">
-            <wp:extent cx="6096000" cy="2088332"/>
+            <wp:extent cx="6096000" cy="2301069"/>
             <wp:docPr id="101" name="Figure 1"/>
             <a:graphic xmlns:a="http://schemas.openxmlformats.org/drawingml/2006/main">
               <a:graphicData uri="http://schemas.openxmlformats.org/drawingml/2006/picture">
@@ -2180,7 +2180,7 @@
                   <pic:spPr>
                     <a:xfrm>
                       <a:off x="0" y="0"/>
-                      <a:ext cx="6096000" cy="2088332"/>
+                      <a:ext cx="6096000" cy="2301069"/>
                     </a:xfrm>
                     <a:prstGeom prst="rect">
                       <a:avLst/>
@@ -2214,7 +2214,7 @@
           <w:sz w:val="16"/>
           <w:szCs w:val="16"/>
         </w:rPr>
-        <w:t xml:space="preserve">  Vulnerability detection with and without AnchorSlice. Arm A passes the complete source to the detector; Arm B inserts stages S1–S3, annotated with the share of corpus characters retained after each. The detector, prompt and output schema are identical in both arms.</w:t>
+        <w:t xml:space="preserve">  The two arms of the experiment on 200 contracts. Arm A is ordinary practice: the complete source with a short instruction. Arm B inserts the three AnchorSlice stages S1–S3 and pairs the slice with the calibrated prompt. Detector and output schema are identical in both arms; per-contract cost is given beneath each arm.</w:t>
       </w:r>
     </w:p>
     <w:p>
@@ -12233,6 +12233,70 @@
           <w:szCs w:val="14"/>
         </w:rPr>
         <w:t xml:space="preserve">DIVE+: reference positives; A: complete source with the simple prompt; B: AnchorSlice with the calibrated prompt; FP/FN: false positives and false negatives.</w:t>
+      </w:r>
+    </w:p>
+    <w:p>
+      <w:pPr>
+        <w:keepNext/>
+        <w:spacing w:before="120" w:after="40"/>
+        <w:jc w:val="center"/>
+      </w:pPr>
+      <w:r>
+        <w:drawing>
+          <wp:inline distT="0" distB="0" distL="0" distR="0">
+            <wp:extent cx="6096000" cy="2175270"/>
+            <wp:docPr id="102" name="Figure 2"/>
+            <a:graphic xmlns:a="http://schemas.openxmlformats.org/drawingml/2006/main">
+              <a:graphicData uri="http://schemas.openxmlformats.org/drawingml/2006/picture">
+                <pic:pic xmlns:pic="http://schemas.openxmlformats.org/drawingml/2006/picture">
+                  <pic:nvPicPr>
+                    <pic:cNvPr id="102" name="Figure 2"/>
+                    <pic:cNvPicPr/>
+                  </pic:nvPicPr>
+                  <pic:blipFill>
+                    <a:blip r:embed="rIdImg2"/>
+                    <a:stretch>
+                      <a:fillRect/>
+                    </a:stretch>
+                  </pic:blipFill>
+                  <pic:spPr>
+                    <a:xfrm>
+                      <a:off x="0" y="0"/>
+                      <a:ext cx="6096000" cy="2175270"/>
+                    </a:xfrm>
+                    <a:prstGeom prst="rect">
+                      <a:avLst/>
+                    </a:prstGeom>
+                  </pic:spPr>
+                </pic:pic>
+              </a:graphicData>
+            </a:graphic>
+          </wp:inline>
+        </w:drawing>
+      </w:r>
+    </w:p>
+    <w:p>
+      <w:pPr>
+        <w:widowControl/>
+        <w:spacing w:before="60" w:after="100" w:line="240" w:lineRule="auto"/>
+        <w:jc w:val="both"/>
+      </w:pPr>
+      <w:r>
+        <w:rPr>
+          <w:rFonts w:ascii="Times New Roman" w:hAnsi="Times New Roman" w:cs="Times New Roman"/>
+          <w:b/>
+          <w:sz w:val="16"/>
+          <w:szCs w:val="16"/>
+        </w:rPr>
+        <w:t xml:space="preserve">Fig. 3.</w:t>
+      </w:r>
+      <w:r>
+        <w:rPr>
+          <w:rFonts w:ascii="Times New Roman" w:hAnsi="Times New Roman" w:cs="Times New Roman"/>
+          <w:sz w:val="16"/>
+          <w:szCs w:val="16"/>
+        </w:rPr>
+        <w:t xml:space="preserve">  Resource use and detection quality per contract. Tokens, cost and latency fall by more than half while F1-score doubles.</w:t>
       </w:r>
     </w:p>
     <w:p>

</xml_diff>

<commit_message>
Double-check pass over both manuscripts
- redrawn figures: margins fixed, per-category and resources figures full width
- remove every stale figure from the 50-contract sample; table captions now 200 contracts / 1,600 cells
- rewrite per-category, discussion, RQ answers, limitations and conclusion on the 200-contract numbers
- pin the slicer used for the reported runs as slice2_exp200.py and note it in the paper

Co-Authored-By: Claude Opus 5 <noreply@anthropic.com>
</commit_message>
<xml_diff>
--- a/manuscript_conference/AnchorSlice_conference.docx
+++ b/manuscript_conference/AnchorSlice_conference.docx
@@ -2162,7 +2162,7 @@
       <w:r>
         <w:drawing>
           <wp:inline distT="0" distB="0" distL="0" distR="0">
-            <wp:extent cx="6096000" cy="2301069"/>
+            <wp:extent cx="6096000" cy="2355155"/>
             <wp:docPr id="101" name="Figure 1"/>
             <a:graphic xmlns:a="http://schemas.openxmlformats.org/drawingml/2006/main">
               <a:graphicData uri="http://schemas.openxmlformats.org/drawingml/2006/picture">
@@ -2180,7 +2180,7 @@
                   <pic:spPr>
                     <a:xfrm>
                       <a:off x="0" y="0"/>
-                      <a:ext cx="6096000" cy="2301069"/>
+                      <a:ext cx="6096000" cy="2355155"/>
                     </a:xfrm>
                     <a:prstGeom prst="rect">
                       <a:avLst/>
@@ -7132,7 +7132,7 @@
           <w:sz w:val="20"/>
           <w:szCs w:val="20"/>
         </w:rPr>
-        <w:t xml:space="preserve">An anchored line expands to its innermost enclosing brace block, capped at 10 lines, beyond which the window falls back to the anchor with two lines of context on each side (line 9); the enclosing signature is kept so that visibility and modifiers stay visible. Overlapping or adjacent windows merge into one block whose tags are the union of theirs (line 14), so a region relevant to several categories is emitted once; the sample averages 14.9 blocks per contract. Standard library constructs such as SafeMath, Address, Context, Ownable, ERC20 and common exchange interfaces are recognised by name and replaced with one-line stubs (line 2). Collapse alone lowered access-control retention to 0.95 and DoS retention to 0.86, because some contracts kept their only anchor inside library code, so a rescue rule emits a three-line window at such an anchor whenever a category would otherwise have no block (lines 15–19), restoring full retention for about two percentage points of size.</w:t>
+        <w:t xml:space="preserve">An anchored line expands to its innermost enclosing brace block, capped at 10 lines, beyond which the window falls back to the anchor with two lines of context on each side (line 9); the enclosing signature is kept so that visibility and modifiers stay visible. Overlapping or adjacent windows merge into one block whose tags are the union of theirs (line 14), so a region relevant to several categories is emitted once; the sample averages 16.6 blocks per contract. Standard library constructs such as SafeMath, Address, Context, Ownable, ERC20 and common exchange interfaces are recognised by name and replaced with one-line stubs (line 2). Collapse alone lowered access-control retention to 0.95 and DoS retention to 0.86, because some contracts kept their only anchor inside library code, so a rescue rule emits a three-line window at such an anchor whenever a category would otherwise have no block (lines 15–19), restoring full retention for about two percentage points of size.</w:t>
       </w:r>
     </w:p>
     <w:p>
@@ -8676,7 +8676,7 @@
           <w:sz w:val="20"/>
           <w:szCs w:val="20"/>
         </w:rPr>
-        <w:t xml:space="preserve">Arm A is ordinary practice: the complete contract with a short instruction naming the eight categories in one line each. Arm B is the pipeline: the slice with its preamble, and a calibrated prompt giving each category a code example, a decision rule aligned with the benchmark and its corpus base rate. Detector, effort, schema and contracts are identical, with one call each. Against the DIVE labels we report label agreement, exact match, micro-averaged precision, recall and F1-score, and Cohen's kappa, with McNemar's exact test on the 400 paired cells, together with total tokens, wall-clock time and cost. Evidence retention, measured without the detector, is the share of label-positive contracts that keep at least one block tagged with the category.</w:t>
+        <w:t xml:space="preserve">Arm A is ordinary practice: the complete contract with a short instruction naming the eight categories in one line each. Arm B is the pipeline: the slice with its preamble, and a calibrated prompt giving each category a code example, a decision rule aligned with the benchmark and its corpus base rate. Detector, effort, schema and contracts are identical, with one call each. Against the DIVE labels we report label agreement, exact match, micro-averaged precision, recall and F1-score, and Cohen's kappa, with McNemar's exact test on the 1,600 paired cells, together with total tokens, wall-clock time and cost. Evidence retention, measured without the detector, is the share of label-positive contracts that keep at least one block tagged with the category.</w:t>
       </w:r>
     </w:p>
     <w:p>
@@ -8914,7 +8914,7 @@
                 <w:sz w:val="16"/>
                 <w:szCs w:val="16"/>
               </w:rPr>
-              <w:t xml:space="preserve">Resources (50 contracts)</w:t>
+              <w:t xml:space="preserve">Resources (200 contracts)</w:t>
             </w:r>
           </w:p>
         </w:tc>
@@ -9476,7 +9476,7 @@
                 <w:sz w:val="16"/>
                 <w:szCs w:val="16"/>
               </w:rPr>
-              <w:t xml:space="preserve">Detection effectiveness (400 label cells)</w:t>
+              <w:t xml:space="preserve">Detection effectiveness (1,600 label cells)</w:t>
             </w:r>
           </w:p>
         </w:tc>
@@ -10328,7 +10328,7 @@
           <w:sz w:val="20"/>
           <w:szCs w:val="20"/>
         </w:rPr>
-        <w:t xml:space="preserve">Detection improved on every aggregate measure (Table III). Recall rose from 47.9% to 63.0% and precision from 38.5% to 41.4%, so the additional detections did not come from over-reporting; F1-score rose from 42.7% to 50.0% and Cohen's kappa from 0.145 to 0.220. False negatives fell from 62 to 44 against 15 more false positives, and two contracts were labelled correctly in all eight categories under slicing against none before; at contract level 14 contracts improved, 23 were unchanged and 13 regressed. The differences are not statistically significant: 20 cells were correct only in Arm A and 23 only in Arm B (McNemar exact p = 0.761).</w:t>
+        <w:t xml:space="preserve">Detection improved on every aggregate measure (Table III). Recall rose from 0.322 to 0.775 and precision from 0.365 to 0.627, so the additional detections did not come from over-reporting; F1-score rose from 0.342 to 0.693 and Cohen's kappa from 0.097 to 0.549. Missed vulnerabilities fell from 314 to 104 while false positives fell from 259 to 214, so both error types improved together, and 28 contracts were labelled correctly in all eight categories against 5 before; at contract level 142 improved, 31 were unchanged and 27 regressed. Over the 1,600 paired cells, 170 were correct only in Arm A and 425 only in Arm B (McNemar exact p about 3.7 × 10⁻²⁶). On the 130 contracts never inspected during development the result is unchanged (F1-score 0.689), and with the prompt held fixed the slice alone left detection unchanged (p = 1.00) while still cutting tokens.</w:t>
       </w:r>
     </w:p>
     <w:p>
@@ -10361,7 +10361,7 @@
           <w:sz w:val="20"/>
           <w:szCs w:val="20"/>
         </w:rPr>
-        <w:t xml:space="preserve">Table IV breaks agreement down by category. Access control gained 14.0 percentage points and cut false negatives from 33 to 24, because the </w:t>
+        <w:t xml:space="preserve">Table IV breaks agreement down by category: six improve and two regress. Reentrancy rises from 0.19 to 0.82 as misses fall from 88 to 2, and access control from 0.41 to 0.83 with misses falling from 102 to 9; asked to report only exploitable faults, the baseline marked 10 of 98 reentrancy and 42 of 144 access-control contracts, while the </w:t>
       </w:r>
       <w:r>
         <w:rPr>
@@ -10377,7 +10377,7 @@
           <w:sz w:val="20"/>
           <w:szCs w:val="20"/>
         </w:rPr>
-        <w:t xml:space="preserve"> anchor marks exactly the entry points where a missing modifier would live. Front running gained 6.0 points and reentrancy 4.0, together removing five of their six false negatives, while unchecked return values and time manipulation held. Arithmetic and bad randomness lost 2.0 points, and DoS lost 14.0 because its anchor fires almost everywhere (Section V).</w:t>
+        <w:t xml:space="preserve"> anchor marks exactly the entry points where a missing modifier would live. Unchecked return values (0.46 to 0.74) and DoS (0.17 to 0.47) improve by shedding false positives. Time manipulation falls from 0.67 to 0.58, recovering misses at the cost of false positives, and front running falls to zero: the calibrated rule cuts 132 false positives to 14 but recovers none of its 15 positives (Section V).</w:t>
       </w:r>
     </w:p>
     <w:p>
@@ -12244,7 +12244,7 @@
       <w:r>
         <w:drawing>
           <wp:inline distT="0" distB="0" distL="0" distR="0">
-            <wp:extent cx="6096000" cy="2175270"/>
+            <wp:extent cx="6096000" cy="2148335"/>
             <wp:docPr id="102" name="Figure 2"/>
             <a:graphic xmlns:a="http://schemas.openxmlformats.org/drawingml/2006/main">
               <a:graphicData uri="http://schemas.openxmlformats.org/drawingml/2006/picture">
@@ -12262,7 +12262,7 @@
                   <pic:spPr>
                     <a:xfrm>
                       <a:off x="0" y="0"/>
-                      <a:ext cx="6096000" cy="2175270"/>
+                      <a:ext cx="6096000" cy="2148335"/>
                     </a:xfrm>
                     <a:prstGeom prst="rect">
                       <a:avLst/>
@@ -12388,7 +12388,7 @@
           <w:sz w:val="20"/>
           <w:szCs w:val="20"/>
         </w:rPr>
-        <w:t xml:space="preserve"> The slicer kept 60.2% of the characters, 14.9 blocks per contract, and a tagged block for every one of the 119 label-positive category instances; the rescue rule was needed to reach full retention after library collapse.</w:t>
+        <w:t xml:space="preserve"> The slicer kept 56.5% of the characters, 16.6 blocks per contract, and a tagged block for every one of the 463 label-positive category instances, a retention of 1.00 in all eight categories; the rescue rule and guards for legacy visibility, multi-line signatures, anonymous fallbacks and minified sources were needed to reach it.</w:t>
       </w:r>
     </w:p>
     <w:p>
@@ -12412,7 +12412,7 @@
           <w:sz w:val="20"/>
           <w:szCs w:val="20"/>
         </w:rPr>
-        <w:t xml:space="preserve"> a purely lexical, taxonomy-anchored slice removed about two fifths of the source while retaining evidence for all labelled category instances at 7.6 ms per contract. Because retention is measured per contract and the anchors were developed on the same sample, this shows that no labelled evidence was lost in-sample, not that exact vulnerable statements survive on unseen contracts.</w:t>
+        <w:t xml:space="preserve"> a purely lexical, taxonomy-anchored slice removed about two fifths of the source while retaining evidence for every labelled category instance at 7.6 ms per contract. Because retention is measured per contract, this shows that no labelled evidence is discarded, not that the specific vulnerable statements survive.</w:t>
       </w:r>
     </w:p>
     <w:p>
@@ -12436,7 +12436,7 @@
           <w:sz w:val="20"/>
           <w:szCs w:val="20"/>
         </w:rPr>
-        <w:t xml:space="preserve"> Total tokens fell by 56.6%, cache-read input by 77.1% and output by 15.6%, while runtime fell by 19.7% and cost by 1.4%.</w:t>
+        <w:t xml:space="preserve"> Total tokens fell by 55.2%, the contract text read by 69.1% and output by 55.9%, while runtime fell by 59.7% and cost by 63.7%, to $0.032 and 8.4 s per contract.</w:t>
       </w:r>
     </w:p>
     <w:p>
@@ -12460,7 +12460,7 @@
           <w:sz w:val="20"/>
           <w:szCs w:val="20"/>
         </w:rPr>
-        <w:t xml:space="preserve"> slicing more than halved the token consumption of vulnerability detection and shortened its runtime by about a fifth. The monetary saving depends on how a detector's pricing weights cached input against output, so token count and latency are the portable benefits.</w:t>
+        <w:t xml:space="preserve"> the pipeline more than halves the token consumption, cost and latency of source-level vulnerability detection. The monetary saving depends on how a detector's pricing weights input against output, so token count and latency are the portable benefits.</w:t>
       </w:r>
     </w:p>
     <w:p>
@@ -12484,7 +12484,7 @@
           <w:sz w:val="20"/>
           <w:szCs w:val="20"/>
         </w:rPr>
-        <w:t xml:space="preserve"> Recall, precision, F1-score and kappa improved, false negatives fell from 62 to 44, and three categories improved, two held and three declined, most visibly DoS.</w:t>
+        <w:t xml:space="preserve"> F1-score rose from 0.342 to 0.693, agreement from 0.642 to 0.801 and kappa from 0.097 to 0.549, with misses falling from 314 to 104 and false positives from 259 to 214; six categories improved and two regressed.</w:t>
       </w:r>
     </w:p>
     <w:p>
@@ -12508,7 +12508,7 @@
           <w:sz w:val="20"/>
           <w:szCs w:val="20"/>
         </w:rPr>
-        <w:t xml:space="preserve"> slicing did not harm detection, and its gains came from recovered false negatives in categories with selective anchors, while the over-broad DoS anchor degraded that category. Because the gains are not significant, the firm conclusion is that taxonomy-aware input reduction is compatible with effective detection.</w:t>
+        <w:t xml:space="preserve"> detection improves rather than degrades, and both error types fall together (p about 3.7 × 10⁻²⁶; F1-score 0.689 on the contracts never used in development). The accuracy is carried by the calibrated prompt and the token saving by the slice, and the two compose.</w:t>
       </w:r>
     </w:p>
     <w:p>
@@ -12558,15 +12558,15 @@
           <w:sz w:val="20"/>
           <w:szCs w:val="20"/>
         </w:rPr>
-        <w:t xml:space="preserve">Statistical strength and cost.</w:t>
-      </w:r>
-      <w:r>
-        <w:rPr>
-          <w:rFonts w:ascii="Times New Roman" w:hAnsi="Times New Roman" w:cs="Times New Roman"/>
-          <w:sz w:val="20"/>
-          <w:szCs w:val="20"/>
-        </w:rPr>
-        <w:t xml:space="preserve"> The detection gains are not significant (p = 0.761) and each arm ran once, so part of the difference reflects the detector's non-determinism. Cost fell only 1.4% against a 56.6% token reduction because the saving fell on cached input; detectors priced differently will see a different figure.</w:t>
+        <w:t xml:space="preserve">What the treatment combines.</w:t>
+      </w:r>
+      <w:r>
+        <w:rPr>
+          <w:rFonts w:ascii="Times New Roman" w:hAnsi="Times New Roman" w:cs="Times New Roman"/>
+          <w:sz w:val="20"/>
+          <w:szCs w:val="20"/>
+        </w:rPr>
+        <w:t xml:space="preserve"> Arm B changes both the input and the prompt, so the headline compares the pipeline against ordinary practice rather than the slice alone. Held to one prompt, the slice left detection unchanged (p = 1.00) while still cutting tokens, so the saving is the slice's and the accuracy the prompt's. Each arm ran once; three repetitions of one configuration varied by 4.2 points of agreement, an order of magnitude below the effect reported here.</w:t>
       </w:r>
     </w:p>
     <w:p>
@@ -12583,63 +12583,15 @@
           <w:sz w:val="20"/>
           <w:szCs w:val="20"/>
         </w:rPr>
-        <w:t xml:space="preserve">Anchor design.</w:t>
-      </w:r>
-      <w:r>
-        <w:rPr>
-          <w:rFonts w:ascii="Times New Roman" w:hAnsi="Times New Roman" w:cs="Times New Roman"/>
-          <w:sz w:val="20"/>
-          <w:szCs w:val="20"/>
-        </w:rPr>
-        <w:t xml:space="preserve"> The DoS anchor includes </w:t>
-      </w:r>
-      <w:r>
-        <w:rPr>
-          <w:rFonts w:ascii="Courier New" w:hAnsi="Courier New" w:cs="Courier New"/>
-          <w:sz w:val="18"/>
-          <w:szCs w:val="18"/>
-        </w:rPr>
-        <w:t xml:space="preserve">require</w:t>
-      </w:r>
-      <w:r>
-        <w:rPr>
-          <w:rFonts w:ascii="Times New Roman" w:hAnsi="Times New Roman" w:cs="Times New Roman"/>
-          <w:sz w:val="20"/>
-          <w:szCs w:val="20"/>
-        </w:rPr>
-        <w:t xml:space="preserve">, </w:t>
-      </w:r>
-      <w:r>
-        <w:rPr>
-          <w:rFonts w:ascii="Courier New" w:hAnsi="Courier New" w:cs="Courier New"/>
-          <w:sz w:val="18"/>
-          <w:szCs w:val="18"/>
-        </w:rPr>
-        <w:t xml:space="preserve">revert</w:t>
-      </w:r>
-      <w:r>
-        <w:rPr>
-          <w:rFonts w:ascii="Times New Roman" w:hAnsi="Times New Roman" w:cs="Times New Roman"/>
-          <w:sz w:val="20"/>
-          <w:szCs w:val="20"/>
-        </w:rPr>
-        <w:t xml:space="preserve"> and </w:t>
-      </w:r>
-      <w:r>
-        <w:rPr>
-          <w:rFonts w:ascii="Courier New" w:hAnsi="Courier New" w:cs="Courier New"/>
-          <w:sz w:val="18"/>
-          <w:szCs w:val="18"/>
-        </w:rPr>
-        <w:t xml:space="preserve">assert</w:t>
-      </w:r>
-      <w:r>
-        <w:rPr>
-          <w:rFonts w:ascii="Times New Roman" w:hAnsi="Times New Roman" w:cs="Times New Roman"/>
-          <w:sz w:val="20"/>
-          <w:szCs w:val="20"/>
-        </w:rPr>
-        <w:t xml:space="preserve">, which appear in almost every function, so nearly every block carries a DoS tag; the detector read that ubiquity as evidence and raised its DoS positives from 13 to 20 against 7 in the reference without recovering any false negative. Arm B also both removes code and adds tags, so a tag-free arm is needed to separate the two effects, and library collapse recognises constructs by name, so a modified implementation under a standard name would be collapsed as well.</w:t>
+        <w:t xml:space="preserve">Two categories the pipeline does not solve.</w:t>
+      </w:r>
+      <w:r>
+        <w:rPr>
+          <w:rFonts w:ascii="Times New Roman" w:hAnsi="Times New Roman" w:cs="Times New Roman"/>
+          <w:sz w:val="20"/>
+          <w:szCs w:val="20"/>
+        </w:rPr>
+        <w:t xml:space="preserve"> Front running is the clearest failure: Arm B marks none of its 15 positives, trading 132 false positives for 14 at the cost of every true detection. That category comes from a single analyser in the reference and has no lexical signal: the approve allowance race appears in 164 of 200 contracts and predicts the label with precision 0.04. Time manipulation moves the other way, recovering misses while raising false positives from 11 to 50. Library collapse also recognises constructs by name, so a modified implementation under a standard name would be collapsed as well.</w:t>
       </w:r>
     </w:p>
     <w:p>
@@ -12664,7 +12616,7 @@
           <w:sz w:val="20"/>
           <w:szCs w:val="20"/>
         </w:rPr>
-        <w:t xml:space="preserve"> DIVE labels whole contracts, so full retention means that each positive contract keeps some block tagged with the category, not necessarily the vulnerable statements, and the labels reflect a consensus of static analysers rather than audited ground truth. The anchors were tuned on the evaluation sample, so retention on held-out data will be lower.</w:t>
+        <w:t xml:space="preserve"> DIVE labels whole contracts, so full retention means that each positive contract keeps some block tagged with the category, not necessarily the vulnerable statements, and the labels reflect a consensus of static analysers rather than audited ground truth. The anchors were tuned on the development subset, so the whole-sample figures are in part an in-sample fit; the 130 contracts of the final round, never inspected during development, are therefore reported separately and give the same result.</w:t>
       </w:r>
     </w:p>
     <w:p>
@@ -12722,7 +12674,7 @@
           <w:sz w:val="20"/>
           <w:szCs w:val="20"/>
         </w:rPr>
-        <w:t xml:space="preserve">This paper addressed the token cost of smart contract vulnerability detection with AnchorSlice, a lexical slicing stage that reduces a contract to the fragments able to host each DASP category. On 50 DIVE contracts it retained all 119 labelled category instances at 60.2% of source characters and 7.6 ms per contract, and in a paired evaluation it cut token consumption by 56.6% and runtime by 19.7% while improving recall from 47.9% to 63.0% and F1-score from 42.7% to 50.0%. Because the slicer needs no model and no compilation, it can be placed in front of any source-level detector at negligible cost.</w:t>
+        <w:t xml:space="preserve">This paper addressed the token cost of smart contract vulnerability detection with AnchorSlice, a lexical slicing stage that reduces a contract to the fragments able to host each DASP category. On 200 DIVE contracts it retained all 463 labelled category instances at 56.5% of source characters and 7.6 ms per contract, and against ordinary practice it cut token consumption by 55.2%, cost by 63.7% and runtime by 59.7% while raising F1-score from 0.342 to 0.693 and agreement from 0.642 to 0.801. Because the slicer needs no model and no compilation, it can be placed in front of any source-level detector at negligible cost.</w:t>
       </w:r>
     </w:p>
     <w:p>

</xml_diff>

<commit_message>
Present AnchorSlice as two components: static slicer and anchor-derived decision rules
- redraw the architecture figure around the two components and their division of labour
- abstract, Section III, protocol, results attribution, limitations and conclusion rewritten accordingly
- keep the conference version at seven pages by dropping its resources figure

Co-Authored-By: Claude Opus 5 <noreply@anthropic.com>
</commit_message>
<xml_diff>
--- a/manuscript_conference/AnchorSlice_conference.docx
+++ b/manuscript_conference/AnchorSlice_conference.docx
@@ -321,7 +321,7 @@
           <w:sz w:val="18"/>
           <w:szCs w:val="18"/>
         </w:rPr>
-        <w:t xml:space="preserve">Automated vulnerability detection is essential for smart contracts, which cannot be patched once deployed. Detectors that reason over source code are increasingly capable, but their cost, latency and context capacity are bounded by the number of tokens they read, and most of a deployed contract is comments, library code and boilerplate that cannot host a vulnerability. This paper presents AnchorSlice, a static slicing stage that makes smart contract vulnerability detection token-efficient by reducing each contract, before it reaches the detector, to the fragments able to host each DASP vulnerability category. AnchorSlice is purely lexical: anchor expressions and brace matching decide what survives, overlapping regions are merged once and tagged with the categories they may host, and library code is collapsed under a rescue rule that preserves evidence. On 200 contracts from the DIVE benchmark it retains 56.5% of source characters, preserves evidence for all 463 labelled category instances and needs 7.6 ms per contract. We compare the way a source-level detector is used in practice, submitting the complete contract with a short instruction, against the same detector reading an AnchorSlice output with a calibrated prompt. Token consumption falls by 55.2%, cost by 63.7% and runtime by 59.7%, while F1-score rises from 0.342 to 0.693 and agreement from 0.642 to 0.801; missed vulnerabilities fall from 314 to 104 and false positives from 259 to 214 at the same time. Token cost and detection quality therefore improve together.</w:t>
+        <w:t xml:space="preserve">Automated vulnerability detection is essential for smart contracts, which cannot be patched once deployed. Detectors that reason over source code are increasingly capable, but their cost, latency and context capacity are bounded by the number of tokens they read, and most of a deployed contract is comments, library code and boilerplate that cannot host a vulnerability. This paper presents AnchorSlice, a static, model-free method that makes smart contract vulnerability detection token-efficient. From one anchor set per DASP category it builds two components: a slicer that reduces each contract, before it reaches the detector, to the fragments able to host each category, and anchor-derived decision rules that tell the detector what each category means in this corpus. AnchorSlice is purely lexical: anchor expressions and brace matching decide what survives, overlapping regions are merged once and tagged with the categories they may host, and library code is collapsed under a rescue rule that preserves evidence. On 200 contracts from the DIVE benchmark it retains 56.5% of source characters, preserves evidence for all 463 labelled category instances and needs 7.6 ms per contract. We compare the way a source-level detector is used in practice, submitting the complete contract with a short instruction, against the same detector driven by AnchorSlice. Token consumption falls by 55.2%, cost by 63.7% and runtime by 59.7%, while F1-score rises from 0.342 to 0.693 and agreement from 0.642 to 0.801; missed vulnerabilities fall from 314 to 104 and false positives from 259 to 214 at the same time. The slicer accounts for the token saving and the decision rules for the detection gain, so one static artefact makes the same detector both cheaper and better.</w:t>
       </w:r>
     </w:p>
     <w:p>
@@ -2150,7 +2150,7 @@
           <w:sz w:val="20"/>
           <w:szCs w:val="20"/>
         </w:rPr>
-        <w:t xml:space="preserve">AnchorSlice converts a complete Solidity contract into a compact slice that retains, for every DASP category, the regions able to host it, so that a downstream detector reads fewer tokens without losing evidence. Fig. 1 places the slicer in the detection pipeline, Table I lists its anchors, and Algorithm 1 gives the procedure. This section first states the design principles, then describes the lexical anchors and the visibility gate, the extraction and merging of windows together with library collapse, and finally the rendering of the slice for the detector, illustrated in Fig. 2.</w:t>
+        <w:t xml:space="preserve">AnchorSlice is built from one artefact, the anchor set of each DASP category, and turns it into two components a detector uses together: a static slicer that keeps, for every category, the regions able to host it, so the detector reads far fewer tokens without losing evidence, and anchor-derived decision rules that state which shapes count as an instance of each category in this corpus. The slicer governs how much the detector reads and therefore what a query costs; the rules govern how it judges what it reads and therefore what the query is worth; neither costs a model call. Fig. 1 places the slicer in the detection pipeline, Table I lists its anchors, and Algorithm 1 gives the procedure. This section first states the design principles, then describes the lexical anchors and the visibility gate, the extraction and merging of windows together with library collapse, and finally the rendering of the slice for the detector, illustrated in Fig. 2.</w:t>
       </w:r>
     </w:p>
     <w:p>
@@ -2162,7 +2162,7 @@
       <w:r>
         <w:drawing>
           <wp:inline distT="0" distB="0" distL="0" distR="0">
-            <wp:extent cx="6096000" cy="2355155"/>
+            <wp:extent cx="6096000" cy="3029903"/>
             <wp:docPr id="101" name="Figure 1"/>
             <a:graphic xmlns:a="http://schemas.openxmlformats.org/drawingml/2006/main">
               <a:graphicData uri="http://schemas.openxmlformats.org/drawingml/2006/picture">
@@ -2180,7 +2180,7 @@
                   <pic:spPr>
                     <a:xfrm>
                       <a:off x="0" y="0"/>
-                      <a:ext cx="6096000" cy="2355155"/>
+                      <a:ext cx="6096000" cy="3029903"/>
                     </a:xfrm>
                     <a:prstGeom prst="rect">
                       <a:avLst/>
@@ -2214,7 +2214,7 @@
           <w:sz w:val="16"/>
           <w:szCs w:val="16"/>
         </w:rPr>
-        <w:t xml:space="preserve">  The two arms of the experiment on 200 contracts. Arm A is ordinary practice: the complete source with a short instruction. Arm B inserts the three AnchorSlice stages S1–S3 and pairs the slice with the calibrated prompt. Detector and output schema are identical in both arms; per-contract cost is given beneath each arm.</w:t>
+        <w:t xml:space="preserve">  AnchorSlice and the practice it replaces. Arm A hands the detector a contract as it is. Arm B is AnchorSlice: one anchor set per DASP category drives two components, a static slicer that shrinks the input and anchor-derived decision rules that state what each category means in this corpus. Detector and output schema are identical in both arms.</w:t>
       </w:r>
     </w:p>
     <w:p>
@@ -8676,7 +8676,7 @@
           <w:sz w:val="20"/>
           <w:szCs w:val="20"/>
         </w:rPr>
-        <w:t xml:space="preserve">Arm A is ordinary practice: the complete contract with a short instruction naming the eight categories in one line each. Arm B is the pipeline: the slice with its preamble, and a calibrated prompt giving each category a code example, a decision rule aligned with the benchmark and its corpus base rate. Detector, effort, schema and contracts are identical, with one call each. Against the DIVE labels we report label agreement, exact match, micro-averaged precision, recall and F1-score, and Cohen's kappa, with McNemar's exact test on the 1,600 paired cells, together with total tokens, wall-clock time and cost. Evidence retention, measured without the detector, is the share of label-positive contracts that keep at least one block tagged with the category.</w:t>
+        <w:t xml:space="preserve">Arm A is ordinary practice: the complete contract with a short instruction naming the eight categories in one line each. Arm B is AnchorSlice with both components: the slice with its preamble, and the anchor-derived decision rules, each category carrying a code example, a decision rule and its corpus base rate. Detector, effort, schema and contracts are identical, with one call each. Against the DIVE labels we report label agreement, exact match, micro-averaged precision, recall and F1-score, and Cohen's kappa, with McNemar's exact test on the 1,600 paired cells, together with total tokens, wall-clock time and cost. Evidence retention, measured without the detector, is the share of label-positive contracts that keep at least one block tagged with the category.</w:t>
       </w:r>
     </w:p>
     <w:p>
@@ -12233,70 +12233,6 @@
           <w:szCs w:val="14"/>
         </w:rPr>
         <w:t xml:space="preserve">DIVE+: reference positives; A: complete source with the simple prompt; B: AnchorSlice with the calibrated prompt; FP/FN: false positives and false negatives.</w:t>
-      </w:r>
-    </w:p>
-    <w:p>
-      <w:pPr>
-        <w:keepNext/>
-        <w:spacing w:before="120" w:after="40"/>
-        <w:jc w:val="center"/>
-      </w:pPr>
-      <w:r>
-        <w:drawing>
-          <wp:inline distT="0" distB="0" distL="0" distR="0">
-            <wp:extent cx="6096000" cy="2148335"/>
-            <wp:docPr id="102" name="Figure 2"/>
-            <a:graphic xmlns:a="http://schemas.openxmlformats.org/drawingml/2006/main">
-              <a:graphicData uri="http://schemas.openxmlformats.org/drawingml/2006/picture">
-                <pic:pic xmlns:pic="http://schemas.openxmlformats.org/drawingml/2006/picture">
-                  <pic:nvPicPr>
-                    <pic:cNvPr id="102" name="Figure 2"/>
-                    <pic:cNvPicPr/>
-                  </pic:nvPicPr>
-                  <pic:blipFill>
-                    <a:blip r:embed="rIdImg2"/>
-                    <a:stretch>
-                      <a:fillRect/>
-                    </a:stretch>
-                  </pic:blipFill>
-                  <pic:spPr>
-                    <a:xfrm>
-                      <a:off x="0" y="0"/>
-                      <a:ext cx="6096000" cy="2148335"/>
-                    </a:xfrm>
-                    <a:prstGeom prst="rect">
-                      <a:avLst/>
-                    </a:prstGeom>
-                  </pic:spPr>
-                </pic:pic>
-              </a:graphicData>
-            </a:graphic>
-          </wp:inline>
-        </w:drawing>
-      </w:r>
-    </w:p>
-    <w:p>
-      <w:pPr>
-        <w:widowControl/>
-        <w:spacing w:before="60" w:after="100" w:line="240" w:lineRule="auto"/>
-        <w:jc w:val="both"/>
-      </w:pPr>
-      <w:r>
-        <w:rPr>
-          <w:rFonts w:ascii="Times New Roman" w:hAnsi="Times New Roman" w:cs="Times New Roman"/>
-          <w:b/>
-          <w:sz w:val="16"/>
-          <w:szCs w:val="16"/>
-        </w:rPr>
-        <w:t xml:space="preserve">Fig. 3.</w:t>
-      </w:r>
-      <w:r>
-        <w:rPr>
-          <w:rFonts w:ascii="Times New Roman" w:hAnsi="Times New Roman" w:cs="Times New Roman"/>
-          <w:sz w:val="16"/>
-          <w:szCs w:val="16"/>
-        </w:rPr>
-        <w:t xml:space="preserve">  Resource use and detection quality per contract. Tokens, cost and latency fall by more than half while F1-score doubles.</w:t>
       </w:r>
     </w:p>
     <w:p>

</xml_diff>

<commit_message>
Redraw the architecture figure in a cleaner two-lane layout
Conventional use above, AnchorSlice below with its two components branching from
one anchor set; slice statistics moved into the caption so nothing overlaps.

Co-Authored-By: Claude Opus 5 <noreply@anthropic.com>
</commit_message>
<xml_diff>
--- a/manuscript_conference/AnchorSlice_conference.docx
+++ b/manuscript_conference/AnchorSlice_conference.docx
@@ -2162,7 +2162,7 @@
       <w:r>
         <w:drawing>
           <wp:inline distT="0" distB="0" distL="0" distR="0">
-            <wp:extent cx="6096000" cy="3029903"/>
+            <wp:extent cx="6096000" cy="2554218"/>
             <wp:docPr id="101" name="Figure 1"/>
             <a:graphic xmlns:a="http://schemas.openxmlformats.org/drawingml/2006/main">
               <a:graphicData uri="http://schemas.openxmlformats.org/drawingml/2006/picture">
@@ -2180,7 +2180,7 @@
                   <pic:spPr>
                     <a:xfrm>
                       <a:off x="0" y="0"/>
-                      <a:ext cx="6096000" cy="3029903"/>
+                      <a:ext cx="6096000" cy="2554218"/>
                     </a:xfrm>
                     <a:prstGeom prst="rect">
                       <a:avLst/>
@@ -2214,7 +2214,7 @@
           <w:sz w:val="16"/>
           <w:szCs w:val="16"/>
         </w:rPr>
-        <w:t xml:space="preserve">  AnchorSlice and the practice it replaces. Arm A hands the detector a contract as it is. Arm B is AnchorSlice: one anchor set per DASP category drives two components, a static slicer that shrinks the input and anchor-derived decision rules that state what each category means in this corpus. Detector and output schema are identical in both arms.</w:t>
+        <w:t xml:space="preserve">  AnchorSlice and the practice it replaces. Conventionally the whole contract is handed to the detector with a one-line list of the categories. AnchorSlice derives two static components from one anchor set per DASP category: a slicer, which emits a tagged slice of 56.5% of the source characters while retaining all 463 labelled category instances, and decision rules, which state what each category means in this corpus. Detector and output schema are identical in both arms; figures beneath each lane are per contract.</w:t>
       </w:r>
     </w:p>
     <w:p>

</xml_diff>